<commit_message>
report: update individual contributions section
</commit_message>
<xml_diff>
--- a/project-report.docx
+++ b/project-report.docx
@@ -1,6 +1,6 @@
 
 <file path=word/document.xml><?xml version="1.0" encoding="utf-8"?>
-<w:document xmlns:wpc="http://schemas.microsoft.com/office/word/2010/wordprocessingCanvas" xmlns:cx="http://schemas.microsoft.com/office/drawing/2014/chartex" xmlns:cx1="http://schemas.microsoft.com/office/drawing/2015/9/8/chartex" xmlns:cx2="http://schemas.microsoft.com/office/drawing/2015/10/21/chartex" xmlns:cx3="http://schemas.microsoft.com/office/drawing/2016/5/9/chartex" xmlns:cx4="http://schemas.microsoft.com/office/drawing/2016/5/10/chartex" xmlns:cx5="http://schemas.microsoft.com/office/drawing/2016/5/11/chartex" xmlns:cx6="http://schemas.microsoft.com/office/drawing/2016/5/12/chartex" xmlns:cx7="http://schemas.microsoft.com/office/drawing/2016/5/13/chartex" xmlns:cx8="http://schemas.microsoft.com/office/drawing/2016/5/14/chartex" xmlns:mc="http://schemas.openxmlformats.org/markup-compatibility/2006" xmlns:aink="http://schemas.microsoft.com/office/drawing/2016/ink" xmlns:am3d="http://schemas.microsoft.com/office/drawing/2017/model3d" xmlns:o="urn:schemas-microsoft-com:office:office" xmlns:r="http://schemas.openxmlformats.org/officeDocument/2006/relationships" xmlns:m="http://schemas.openxmlformats.org/officeDocument/2006/math" xmlns:v="urn:schemas-microsoft-com:vml" xmlns:wp14="http://schemas.microsoft.com/office/word/2010/wordprocessingDrawing" xmlns:wp="http://schemas.openxmlformats.org/drawingml/2006/wordprocessingDrawing" xmlns:w10="urn:schemas-microsoft-com:office:word" xmlns:w="http://schemas.openxmlformats.org/wordprocessingml/2006/main" xmlns:w14="http://schemas.microsoft.com/office/word/2010/wordml" xmlns:w15="http://schemas.microsoft.com/office/word/2012/wordml" xmlns:w16cex="http://schemas.microsoft.com/office/word/2018/wordml/cex" xmlns:w16cid="http://schemas.microsoft.com/office/word/2016/wordml/cid" xmlns:w16="http://schemas.microsoft.com/office/word/2018/wordml" xmlns:w16sdtdh="http://schemas.microsoft.com/office/word/2020/wordml/sdtdatahash" xmlns:w16se="http://schemas.microsoft.com/office/word/2015/wordml/symex" xmlns:wpg="http://schemas.microsoft.com/office/word/2010/wordprocessingGroup" xmlns:wpi="http://schemas.microsoft.com/office/word/2010/wordprocessingInk" xmlns:wne="http://schemas.microsoft.com/office/word/2006/wordml" xmlns:wps="http://schemas.microsoft.com/office/word/2010/wordprocessingShape" mc:Ignorable="w14 w15 w16se w16cid w16 w16cex w16sdtdh wp14">
+<w:document xmlns:wpc="http://schemas.microsoft.com/office/word/2010/wordprocessingCanvas" xmlns:cx="http://schemas.microsoft.com/office/drawing/2014/chartex" xmlns:cx1="http://schemas.microsoft.com/office/drawing/2015/9/8/chartex" xmlns:cx2="http://schemas.microsoft.com/office/drawing/2015/10/21/chartex" xmlns:cx3="http://schemas.microsoft.com/office/drawing/2016/5/9/chartex" xmlns:cx4="http://schemas.microsoft.com/office/drawing/2016/5/10/chartex" xmlns:cx5="http://schemas.microsoft.com/office/drawing/2016/5/11/chartex" xmlns:cx6="http://schemas.microsoft.com/office/drawing/2016/5/12/chartex" xmlns:cx7="http://schemas.microsoft.com/office/drawing/2016/5/13/chartex" xmlns:cx8="http://schemas.microsoft.com/office/drawing/2016/5/14/chartex" xmlns:mc="http://schemas.openxmlformats.org/markup-compatibility/2006" xmlns:aink="http://schemas.microsoft.com/office/drawing/2016/ink" xmlns:am3d="http://schemas.microsoft.com/office/drawing/2017/model3d" xmlns:o="urn:schemas-microsoft-com:office:office" xmlns:oel="http://schemas.microsoft.com/office/2019/extlst" xmlns:r="http://schemas.openxmlformats.org/officeDocument/2006/relationships" xmlns:m="http://schemas.openxmlformats.org/officeDocument/2006/math" xmlns:v="urn:schemas-microsoft-com:vml" xmlns:wp14="http://schemas.microsoft.com/office/word/2010/wordprocessingDrawing" xmlns:wp="http://schemas.openxmlformats.org/drawingml/2006/wordprocessingDrawing" xmlns:w10="urn:schemas-microsoft-com:office:word" xmlns:w="http://schemas.openxmlformats.org/wordprocessingml/2006/main" xmlns:w14="http://schemas.microsoft.com/office/word/2010/wordml" xmlns:w15="http://schemas.microsoft.com/office/word/2012/wordml" xmlns:w16cex="http://schemas.microsoft.com/office/word/2018/wordml/cex" xmlns:w16cid="http://schemas.microsoft.com/office/word/2016/wordml/cid" xmlns:w16="http://schemas.microsoft.com/office/word/2018/wordml" xmlns:w16du="http://schemas.microsoft.com/office/word/2023/wordml/word16du" xmlns:w16sdtdh="http://schemas.microsoft.com/office/word/2020/wordml/sdtdatahash" xmlns:w16sdtfl="http://schemas.microsoft.com/office/word/2024/wordml/sdtformatlock" xmlns:w16se="http://schemas.microsoft.com/office/word/2015/wordml/symex" xmlns:wpg="http://schemas.microsoft.com/office/word/2010/wordprocessingGroup" xmlns:wpi="http://schemas.microsoft.com/office/word/2010/wordprocessingInk" xmlns:wne="http://schemas.microsoft.com/office/word/2006/wordml" xmlns:wps="http://schemas.microsoft.com/office/word/2010/wordprocessingShape" mc:Ignorable="w14 w15 w16se w16cid w16 w16cex w16sdtdh w16sdtfl w16du wp14">
   <w:body>
     <w:p>
       <w:pPr>
@@ -62,7 +62,7 @@
           <w:rFonts w:eastAsiaTheme="minorHAnsi" w:cstheme="minorBidi"/>
           <w:sz w:val="32"/>
           <w:szCs w:val="32"/>
-          <w:lang w:val="en-150"/>
+          <w:lang/>
         </w:rPr>
       </w:pPr>
     </w:p>
@@ -76,60 +76,18 @@
           <w:rFonts w:eastAsiaTheme="minorHAnsi" w:cstheme="minorBidi"/>
           <w:sz w:val="32"/>
           <w:szCs w:val="32"/>
-          <w:lang w:val="en-150"/>
-        </w:rPr>
-      </w:pPr>
-      <w:proofErr w:type="spellStart"/>
+          <w:lang/>
+        </w:rPr>
+      </w:pPr>
       <w:r>
         <w:rPr>
           <w:rFonts w:eastAsiaTheme="minorHAnsi" w:cstheme="minorBidi"/>
           <w:sz w:val="32"/>
           <w:szCs w:val="32"/>
-          <w:lang w:val="en-150"/>
-        </w:rPr>
-        <w:t>თბილისის</w:t>
-      </w:r>
-      <w:proofErr w:type="spellEnd"/>
-      <w:r>
-        <w:rPr>
-          <w:rFonts w:eastAsiaTheme="minorHAnsi" w:cstheme="minorBidi"/>
-          <w:sz w:val="32"/>
-          <w:szCs w:val="32"/>
-          <w:lang w:val="en-150"/>
-        </w:rPr>
-        <w:t xml:space="preserve"> </w:t>
-      </w:r>
-      <w:proofErr w:type="spellStart"/>
-      <w:r>
-        <w:rPr>
-          <w:rFonts w:eastAsiaTheme="minorHAnsi" w:cstheme="minorBidi"/>
-          <w:sz w:val="32"/>
-          <w:szCs w:val="32"/>
-          <w:lang w:val="en-150"/>
-        </w:rPr>
-        <w:t>თავისუფალი</w:t>
-      </w:r>
-      <w:proofErr w:type="spellEnd"/>
-      <w:r>
-        <w:rPr>
-          <w:rFonts w:eastAsiaTheme="minorHAnsi" w:cstheme="minorBidi"/>
-          <w:sz w:val="32"/>
-          <w:szCs w:val="32"/>
-          <w:lang w:val="en-150"/>
-        </w:rPr>
-        <w:t xml:space="preserve"> </w:t>
-      </w:r>
-      <w:proofErr w:type="spellStart"/>
-      <w:r>
-        <w:rPr>
-          <w:rFonts w:eastAsiaTheme="minorHAnsi" w:cstheme="minorBidi"/>
-          <w:sz w:val="32"/>
-          <w:szCs w:val="32"/>
-          <w:lang w:val="en-150"/>
-        </w:rPr>
-        <w:t>უნივერსიტეტი</w:t>
-      </w:r>
-      <w:proofErr w:type="spellEnd"/>
+          <w:lang/>
+        </w:rPr>
+        <w:t>თბილისის თავისუფალი უნივერსიტეტი</w:t>
+      </w:r>
     </w:p>
     <w:p>
       <w:pPr>
@@ -141,7 +99,7 @@
           <w:rFonts w:eastAsiaTheme="minorHAnsi" w:cstheme="minorBidi"/>
           <w:sz w:val="32"/>
           <w:szCs w:val="32"/>
-          <w:lang w:val="en-150"/>
+          <w:lang/>
         </w:rPr>
       </w:pPr>
     </w:p>
@@ -155,100 +113,18 @@
           <w:rFonts w:eastAsiaTheme="minorHAnsi" w:cstheme="minorBidi"/>
           <w:sz w:val="32"/>
           <w:szCs w:val="32"/>
-          <w:lang w:val="en-150"/>
-        </w:rPr>
-      </w:pPr>
-      <w:proofErr w:type="spellStart"/>
+          <w:lang/>
+        </w:rPr>
+      </w:pPr>
       <w:r>
         <w:rPr>
           <w:rFonts w:eastAsiaTheme="minorHAnsi" w:cstheme="minorBidi"/>
           <w:sz w:val="32"/>
           <w:szCs w:val="32"/>
-          <w:lang w:val="en-150"/>
-        </w:rPr>
-        <w:t>კომპიუტერული</w:t>
-      </w:r>
-      <w:proofErr w:type="spellEnd"/>
-      <w:r>
-        <w:rPr>
-          <w:rFonts w:eastAsiaTheme="minorHAnsi" w:cstheme="minorBidi"/>
-          <w:sz w:val="32"/>
-          <w:szCs w:val="32"/>
-          <w:lang w:val="en-150"/>
-        </w:rPr>
-        <w:t xml:space="preserve"> </w:t>
-      </w:r>
-      <w:proofErr w:type="spellStart"/>
-      <w:r>
-        <w:rPr>
-          <w:rFonts w:eastAsiaTheme="minorHAnsi" w:cstheme="minorBidi"/>
-          <w:sz w:val="32"/>
-          <w:szCs w:val="32"/>
-          <w:lang w:val="en-150"/>
-        </w:rPr>
-        <w:t>მეცნიერებების</w:t>
-      </w:r>
-      <w:proofErr w:type="spellEnd"/>
-      <w:r>
-        <w:rPr>
-          <w:rFonts w:eastAsiaTheme="minorHAnsi" w:cstheme="minorBidi"/>
-          <w:sz w:val="32"/>
-          <w:szCs w:val="32"/>
-          <w:lang w:val="en-150"/>
-        </w:rPr>
-        <w:t xml:space="preserve">, </w:t>
-      </w:r>
-      <w:proofErr w:type="spellStart"/>
-      <w:r>
-        <w:rPr>
-          <w:rFonts w:eastAsiaTheme="minorHAnsi" w:cstheme="minorBidi"/>
-          <w:sz w:val="32"/>
-          <w:szCs w:val="32"/>
-          <w:lang w:val="en-150"/>
-        </w:rPr>
-        <w:t>მათემატიკისა</w:t>
-      </w:r>
-      <w:proofErr w:type="spellEnd"/>
-      <w:r>
-        <w:rPr>
-          <w:rFonts w:eastAsiaTheme="minorHAnsi" w:cstheme="minorBidi"/>
-          <w:sz w:val="32"/>
-          <w:szCs w:val="32"/>
-          <w:lang w:val="en-150"/>
-        </w:rPr>
-        <w:t xml:space="preserve"> </w:t>
-      </w:r>
-      <w:proofErr w:type="spellStart"/>
-      <w:r>
-        <w:rPr>
-          <w:rFonts w:eastAsiaTheme="minorHAnsi" w:cstheme="minorBidi"/>
-          <w:sz w:val="32"/>
-          <w:szCs w:val="32"/>
-          <w:lang w:val="en-150"/>
-        </w:rPr>
-        <w:t>და</w:t>
-      </w:r>
-      <w:proofErr w:type="spellEnd"/>
-      <w:r>
-        <w:rPr>
-          <w:rFonts w:eastAsiaTheme="minorHAnsi" w:cstheme="minorBidi"/>
-          <w:sz w:val="32"/>
-          <w:szCs w:val="32"/>
-          <w:lang w:val="en-150"/>
-        </w:rPr>
-        <w:t xml:space="preserve"> </w:t>
-      </w:r>
-      <w:proofErr w:type="spellStart"/>
-      <w:r>
-        <w:rPr>
-          <w:rFonts w:eastAsiaTheme="minorHAnsi" w:cstheme="minorBidi"/>
-          <w:sz w:val="32"/>
-          <w:szCs w:val="32"/>
-          <w:lang w:val="en-150"/>
-        </w:rPr>
-        <w:t>ინჟინერიის</w:t>
-      </w:r>
-      <w:proofErr w:type="spellEnd"/>
+          <w:lang/>
+        </w:rPr>
+        <w:t>კომპიუტერული მეცნიერებების, მათემატიკისა და ინჟინერიის</w:t>
+      </w:r>
     </w:p>
     <w:p>
       <w:pPr>
@@ -260,25 +136,14 @@
           <w:sz w:val="32"/>
         </w:rPr>
       </w:pPr>
-      <w:proofErr w:type="spellStart"/>
       <w:r>
         <w:rPr>
           <w:rFonts w:eastAsiaTheme="minorHAnsi" w:cstheme="minorBidi"/>
           <w:sz w:val="32"/>
           <w:szCs w:val="32"/>
-          <w:lang w:val="en-150"/>
-        </w:rPr>
-        <w:t>სკოლა</w:t>
-      </w:r>
-      <w:proofErr w:type="spellEnd"/>
-      <w:r>
-        <w:rPr>
-          <w:rFonts w:eastAsiaTheme="minorHAnsi" w:cstheme="minorBidi"/>
-          <w:sz w:val="32"/>
-          <w:szCs w:val="32"/>
-          <w:lang w:val="en-150"/>
-        </w:rPr>
-        <w:t xml:space="preserve"> (MACS[E])</w:t>
+          <w:lang/>
+        </w:rPr>
+        <w:t>სკოლა (MACS[E])</w:t>
       </w:r>
     </w:p>
     <w:p>
@@ -314,7 +179,6 @@
           <w:szCs w:val="28"/>
         </w:rPr>
       </w:pPr>
-      <w:proofErr w:type="spellStart"/>
       <w:r>
         <w:rPr>
           <w:sz w:val="28"/>
@@ -322,7 +186,6 @@
         </w:rPr>
         <w:t>ელექტრო</w:t>
       </w:r>
-      <w:proofErr w:type="spellEnd"/>
       <w:r>
         <w:rPr>
           <w:spacing w:val="-6"/>
@@ -331,7 +194,6 @@
         </w:rPr>
         <w:t xml:space="preserve"> </w:t>
       </w:r>
-      <w:proofErr w:type="spellStart"/>
       <w:r>
         <w:rPr>
           <w:sz w:val="28"/>
@@ -339,7 +201,6 @@
         </w:rPr>
         <w:t>და</w:t>
       </w:r>
-      <w:proofErr w:type="spellEnd"/>
       <w:r>
         <w:rPr>
           <w:spacing w:val="-6"/>
@@ -348,7 +209,6 @@
         </w:rPr>
         <w:t xml:space="preserve"> </w:t>
       </w:r>
-      <w:proofErr w:type="spellStart"/>
       <w:r>
         <w:rPr>
           <w:sz w:val="28"/>
@@ -356,7 +216,6 @@
         </w:rPr>
         <w:t>კომპიუტერული</w:t>
       </w:r>
-      <w:proofErr w:type="spellEnd"/>
       <w:r>
         <w:rPr>
           <w:spacing w:val="-8"/>
@@ -365,7 +224,6 @@
         </w:rPr>
         <w:t xml:space="preserve"> </w:t>
       </w:r>
-      <w:proofErr w:type="spellStart"/>
       <w:r>
         <w:rPr>
           <w:sz w:val="28"/>
@@ -373,7 +231,6 @@
         </w:rPr>
         <w:t>ინჟინერიის</w:t>
       </w:r>
-      <w:proofErr w:type="spellEnd"/>
       <w:r>
         <w:rPr>
           <w:spacing w:val="-5"/>
@@ -382,7 +239,6 @@
         </w:rPr>
         <w:t xml:space="preserve"> </w:t>
       </w:r>
-      <w:proofErr w:type="spellStart"/>
       <w:r>
         <w:rPr>
           <w:spacing w:val="-2"/>
@@ -391,7 +247,6 @@
         </w:rPr>
         <w:t>პროგრამა</w:t>
       </w:r>
-      <w:proofErr w:type="spellEnd"/>
     </w:p>
     <w:p>
       <w:pPr>
@@ -526,14 +381,12 @@
         <w:ind w:left="291" w:right="351"/>
         <w:jc w:val="center"/>
       </w:pPr>
-      <w:proofErr w:type="spellStart"/>
       <w:r>
         <w:rPr>
           <w:spacing w:val="-2"/>
         </w:rPr>
         <w:t>თბილისი</w:t>
       </w:r>
-      <w:proofErr w:type="spellEnd"/>
     </w:p>
     <w:p>
       <w:pPr>
@@ -616,15 +469,7 @@
           <w:szCs w:val="24"/>
           <w:lang w:val="en-US"/>
         </w:rPr>
-        <w:t>get acquainted</w:t>
-      </w:r>
-      <w:r>
-        <w:rPr>
-          <w:sz w:val="24"/>
-          <w:szCs w:val="24"/>
-          <w:lang w:val="en-US"/>
-        </w:rPr>
-        <w:t xml:space="preserve"> </w:t>
+        <w:t xml:space="preserve">get acquainted </w:t>
       </w:r>
       <w:r>
         <w:rPr>
@@ -672,25 +517,7 @@
           <w:szCs w:val="24"/>
           <w:lang w:val="en-US"/>
         </w:rPr>
-        <w:t xml:space="preserve"> At the end of the project, all of the aforementioned goals were achieved: we successfully designed a synthesizer, obtained competence in necessary software and deepened our knowledge of analog electronics. We designed, simulated in SPICE and built (soldered) on a </w:t>
-      </w:r>
-      <w:proofErr w:type="spellStart"/>
-      <w:r>
-        <w:rPr>
-          <w:sz w:val="24"/>
-          <w:szCs w:val="24"/>
-          <w:lang w:val="en-US"/>
-        </w:rPr>
-        <w:t>perfboard</w:t>
-      </w:r>
-      <w:proofErr w:type="spellEnd"/>
-      <w:r>
-        <w:rPr>
-          <w:sz w:val="24"/>
-          <w:szCs w:val="24"/>
-          <w:lang w:val="en-US"/>
-        </w:rPr>
-        <w:t xml:space="preserve"> the following modules: Sequencer, VCO (Voltage-Controlled Oscillator, VCA (Voltage-Controlled Amplifier), Mixer. We’ve also designed a ready-for-printing PCB design of a Sequencer and a VCO.</w:t>
+        <w:t xml:space="preserve"> At the end of the project, all of the aforementioned goals were achieved: we successfully designed a synthesizer, obtained competence in necessary software and deepened our knowledge of analog electronics. We designed, simulated in SPICE and built (soldered) on a perfboard the following modules: Sequencer, VCO (Voltage-Controlled Oscillator, VCA (Voltage-Controlled Amplifier), Mixer. We’ve also designed a ready-for-printing PCB design of a Sequencer and a VCO.</w:t>
       </w:r>
     </w:p>
     <w:p>
@@ -750,43 +577,39 @@
           <w:szCs w:val="24"/>
           <w:lang w:val="ka-GE"/>
         </w:rPr>
-        <w:t>ირად გამოყენებადი კომპონენტების (</w:t>
-      </w:r>
-      <w:proofErr w:type="spellStart"/>
+        <w:t xml:space="preserve">ირად გამოყენებადი კომპონენტების (რეზისტორები, ტრანზისტორები, ოპ-ამპები და სხვ.) და პროექტის სამუშაო პროცესის გაცნობა; </w:t>
+      </w:r>
       <w:r>
         <w:rPr>
           <w:sz w:val="24"/>
           <w:szCs w:val="24"/>
           <w:lang w:val="ka-GE"/>
         </w:rPr>
-        <w:t>რეზისტორები</w:t>
-      </w:r>
-      <w:proofErr w:type="spellEnd"/>
+        <w:t xml:space="preserve">SPICE </w:t>
+      </w:r>
       <w:r>
         <w:rPr>
           <w:sz w:val="24"/>
           <w:szCs w:val="24"/>
           <w:lang w:val="ka-GE"/>
         </w:rPr>
-        <w:t>, ტრანზისტორები, ოპ-</w:t>
-      </w:r>
-      <w:proofErr w:type="spellStart"/>
+        <w:t xml:space="preserve">სიმულაციისა, სქემატური და </w:t>
+      </w:r>
       <w:r>
         <w:rPr>
           <w:sz w:val="24"/>
           <w:szCs w:val="24"/>
           <w:lang w:val="ka-GE"/>
         </w:rPr>
-        <w:t>ამპები</w:t>
-      </w:r>
-      <w:proofErr w:type="spellEnd"/>
+        <w:t xml:space="preserve">PCB </w:t>
+      </w:r>
       <w:r>
         <w:rPr>
           <w:sz w:val="24"/>
           <w:szCs w:val="24"/>
           <w:lang w:val="ka-GE"/>
         </w:rPr>
-        <w:t xml:space="preserve"> და სხვ.) და პროექტის სამუშაო პროცესის გაცნობა; </w:t>
+        <w:t xml:space="preserve">დიზაინებისთვის ხშირად გამოყენებადი პროგრამების შესწავლა და ელექტრულ აპარატურასთან მუშაობის პრაქტიკული გამოცდილების მიღება ანალოგური მოდულარული სინთეზატორის შექმნისა გაკეთების გზით. პროექტის დასასრულ, ყველა აღნიშნული მიზანი იქნა მიღწეული: ჩვენ წარმატებით შევქმენით სინთეზატორი, შევიძინეთ აუცილებელ პროგრამულ უზრუნველყოფასთან მუშაობის უნარები და გავიღრმავეთ ცოდნა ანალოგური ელექტრონიკის სფეროში. </w:t>
       </w:r>
       <w:r>
         <w:rPr>
@@ -794,7 +617,7 @@
           <w:szCs w:val="24"/>
           <w:lang w:val="ka-GE"/>
         </w:rPr>
-        <w:t xml:space="preserve">SPICE </w:t>
+        <w:t xml:space="preserve">ჩვენ დავაპროექტეთ, მოვახდინეთ SPICE სიმულირება და </w:t>
       </w:r>
       <w:r>
         <w:rPr>
@@ -802,7 +625,7 @@
           <w:szCs w:val="24"/>
           <w:lang w:val="ka-GE"/>
         </w:rPr>
-        <w:t xml:space="preserve">სიმულაციისა, სქემატური და </w:t>
+        <w:t>სამონტაჟო დაფაზე (</w:t>
       </w:r>
       <w:r>
         <w:rPr>
@@ -810,6 +633,38 @@
           <w:szCs w:val="24"/>
           <w:lang w:val="ka-GE"/>
         </w:rPr>
+        <w:t xml:space="preserve">perfboard) ავაწყვეთ (შედუღებით) შემდეგი მოდულები: VCO (Voltage-Controlled Oscillator, VCA (Voltage-Controlled Amplifier), Mixer. </w:t>
+      </w:r>
+      <w:r>
+        <w:rPr>
+          <w:sz w:val="24"/>
+          <w:szCs w:val="24"/>
+          <w:lang w:val="ka-GE"/>
+        </w:rPr>
+        <w:t>ასევე შევქმენი</w:t>
+      </w:r>
+      <w:r>
+        <w:rPr>
+          <w:sz w:val="24"/>
+          <w:szCs w:val="24"/>
+          <w:lang w:val="ka-GE"/>
+        </w:rPr>
+        <w:t>თ</w:t>
+      </w:r>
+      <w:r>
+        <w:rPr>
+          <w:sz w:val="24"/>
+          <w:szCs w:val="24"/>
+          <w:lang w:val="ka-GE"/>
+        </w:rPr>
+        <w:t xml:space="preserve"> დაბეჭდისთვის მზა </w:t>
+      </w:r>
+      <w:r>
+        <w:rPr>
+          <w:sz w:val="24"/>
+          <w:szCs w:val="24"/>
+          <w:lang w:val="ka-GE"/>
+        </w:rPr>
         <w:t xml:space="preserve">PCB </w:t>
       </w:r>
       <w:r>
@@ -818,7 +673,7 @@
           <w:szCs w:val="24"/>
           <w:lang w:val="ka-GE"/>
         </w:rPr>
-        <w:t xml:space="preserve">დიზაინებისთვის ხშირად გამოყენებადი პროგრამების შესწავლა და ელექტრულ აპარატურასთან მუშაობის პრაქტიკული გამოცდილების მიღება ანალოგური მოდულარული სინთეზატორის შექმნისა გაკეთების გზით. პროექტის დასასრულ, ყველა აღნიშნული მიზანი იქნა მიღწეული: ჩვენ წარმატებით შევქმენით სინთეზატორი, შევიძინეთ აუცილებელ პროგრამულ უზრუნველყოფასთან მუშაობის უნარები და გავიღრმავეთ ცოდნა ანალოგური ელექტრონიკის სფეროში. </w:t>
+        <w:t>დიზაინი</w:t>
       </w:r>
       <w:r>
         <w:rPr>
@@ -826,7 +681,7 @@
           <w:szCs w:val="24"/>
           <w:lang w:val="ka-GE"/>
         </w:rPr>
-        <w:t xml:space="preserve">ჩვენ დავაპროექტეთ, მოვახდინეთ </w:t>
+        <w:t xml:space="preserve"> შემდეგი მოდულებისთვის: </w:t>
       </w:r>
       <w:r>
         <w:rPr>
@@ -834,241 +689,7 @@
           <w:szCs w:val="24"/>
           <w:lang w:val="ka-GE"/>
         </w:rPr>
-        <w:t xml:space="preserve">SPICE </w:t>
-      </w:r>
-      <w:r>
-        <w:rPr>
-          <w:sz w:val="24"/>
-          <w:szCs w:val="24"/>
-          <w:lang w:val="ka-GE"/>
-        </w:rPr>
-        <w:t xml:space="preserve">სიმულირება და </w:t>
-      </w:r>
-      <w:r>
-        <w:rPr>
-          <w:sz w:val="24"/>
-          <w:szCs w:val="24"/>
-          <w:lang w:val="ka-GE"/>
-        </w:rPr>
-        <w:t>სამონტაჟო დაფაზე (</w:t>
-      </w:r>
-      <w:proofErr w:type="spellStart"/>
-      <w:r>
-        <w:rPr>
-          <w:sz w:val="24"/>
-          <w:szCs w:val="24"/>
-          <w:lang w:val="ka-GE"/>
-        </w:rPr>
-        <w:t>perfboard</w:t>
-      </w:r>
-      <w:proofErr w:type="spellEnd"/>
-      <w:r>
-        <w:rPr>
-          <w:sz w:val="24"/>
-          <w:szCs w:val="24"/>
-          <w:lang w:val="ka-GE"/>
-        </w:rPr>
-        <w:t xml:space="preserve">) </w:t>
-      </w:r>
-      <w:r>
-        <w:rPr>
-          <w:sz w:val="24"/>
-          <w:szCs w:val="24"/>
-          <w:lang w:val="ka-GE"/>
-        </w:rPr>
-        <w:t>ავაწყვეთ (</w:t>
-      </w:r>
-      <w:proofErr w:type="spellStart"/>
-      <w:r>
-        <w:rPr>
-          <w:sz w:val="24"/>
-          <w:szCs w:val="24"/>
-          <w:lang w:val="ka-GE"/>
-        </w:rPr>
-        <w:t>შედუღებით</w:t>
-      </w:r>
-      <w:proofErr w:type="spellEnd"/>
-      <w:r>
-        <w:rPr>
-          <w:sz w:val="24"/>
-          <w:szCs w:val="24"/>
-          <w:lang w:val="ka-GE"/>
-        </w:rPr>
-        <w:t>) შემდეგი მოდულები: VCO (</w:t>
-      </w:r>
-      <w:proofErr w:type="spellStart"/>
-      <w:r>
-        <w:rPr>
-          <w:sz w:val="24"/>
-          <w:szCs w:val="24"/>
-          <w:lang w:val="ka-GE"/>
-        </w:rPr>
-        <w:t>Voltage-Controlled</w:t>
-      </w:r>
-      <w:proofErr w:type="spellEnd"/>
-      <w:r>
-        <w:rPr>
-          <w:sz w:val="24"/>
-          <w:szCs w:val="24"/>
-          <w:lang w:val="ka-GE"/>
-        </w:rPr>
-        <w:t xml:space="preserve"> </w:t>
-      </w:r>
-      <w:proofErr w:type="spellStart"/>
-      <w:r>
-        <w:rPr>
-          <w:sz w:val="24"/>
-          <w:szCs w:val="24"/>
-          <w:lang w:val="ka-GE"/>
-        </w:rPr>
-        <w:t>Oscillator</w:t>
-      </w:r>
-      <w:proofErr w:type="spellEnd"/>
-      <w:r>
-        <w:rPr>
-          <w:sz w:val="24"/>
-          <w:szCs w:val="24"/>
-          <w:lang w:val="ka-GE"/>
-        </w:rPr>
-        <w:t>, VCA (</w:t>
-      </w:r>
-      <w:proofErr w:type="spellStart"/>
-      <w:r>
-        <w:rPr>
-          <w:sz w:val="24"/>
-          <w:szCs w:val="24"/>
-          <w:lang w:val="ka-GE"/>
-        </w:rPr>
-        <w:t>Voltage-Controlled</w:t>
-      </w:r>
-      <w:proofErr w:type="spellEnd"/>
-      <w:r>
-        <w:rPr>
-          <w:sz w:val="24"/>
-          <w:szCs w:val="24"/>
-          <w:lang w:val="ka-GE"/>
-        </w:rPr>
-        <w:t xml:space="preserve"> </w:t>
-      </w:r>
-      <w:proofErr w:type="spellStart"/>
-      <w:r>
-        <w:rPr>
-          <w:sz w:val="24"/>
-          <w:szCs w:val="24"/>
-          <w:lang w:val="ka-GE"/>
-        </w:rPr>
-        <w:t>Amplifier</w:t>
-      </w:r>
-      <w:proofErr w:type="spellEnd"/>
-      <w:r>
-        <w:rPr>
-          <w:sz w:val="24"/>
-          <w:szCs w:val="24"/>
-          <w:lang w:val="ka-GE"/>
-        </w:rPr>
-        <w:t xml:space="preserve">), </w:t>
-      </w:r>
-      <w:proofErr w:type="spellStart"/>
-      <w:r>
-        <w:rPr>
-          <w:sz w:val="24"/>
-          <w:szCs w:val="24"/>
-          <w:lang w:val="ka-GE"/>
-        </w:rPr>
-        <w:t>Mixer</w:t>
-      </w:r>
-      <w:proofErr w:type="spellEnd"/>
-      <w:r>
-        <w:rPr>
-          <w:sz w:val="24"/>
-          <w:szCs w:val="24"/>
-          <w:lang w:val="ka-GE"/>
-        </w:rPr>
-        <w:t xml:space="preserve">. </w:t>
-      </w:r>
-      <w:r>
-        <w:rPr>
-          <w:sz w:val="24"/>
-          <w:szCs w:val="24"/>
-          <w:lang w:val="ka-GE"/>
-        </w:rPr>
-        <w:t>ასევე შევქმენი</w:t>
-      </w:r>
-      <w:r>
-        <w:rPr>
-          <w:sz w:val="24"/>
-          <w:szCs w:val="24"/>
-          <w:lang w:val="ka-GE"/>
-        </w:rPr>
-        <w:t>თ</w:t>
-      </w:r>
-      <w:r>
-        <w:rPr>
-          <w:sz w:val="24"/>
-          <w:szCs w:val="24"/>
-          <w:lang w:val="ka-GE"/>
-        </w:rPr>
-        <w:t xml:space="preserve"> </w:t>
-      </w:r>
-      <w:proofErr w:type="spellStart"/>
-      <w:r>
-        <w:rPr>
-          <w:sz w:val="24"/>
-          <w:szCs w:val="24"/>
-          <w:lang w:val="ka-GE"/>
-        </w:rPr>
-        <w:t>დაბეჭდისთვის</w:t>
-      </w:r>
-      <w:proofErr w:type="spellEnd"/>
-      <w:r>
-        <w:rPr>
-          <w:sz w:val="24"/>
-          <w:szCs w:val="24"/>
-          <w:lang w:val="ka-GE"/>
-        </w:rPr>
-        <w:t xml:space="preserve"> მზა </w:t>
-      </w:r>
-      <w:r>
-        <w:rPr>
-          <w:sz w:val="24"/>
-          <w:szCs w:val="24"/>
-          <w:lang w:val="ka-GE"/>
-        </w:rPr>
-        <w:t xml:space="preserve">PCB </w:t>
-      </w:r>
-      <w:r>
-        <w:rPr>
-          <w:sz w:val="24"/>
-          <w:szCs w:val="24"/>
-          <w:lang w:val="ka-GE"/>
-        </w:rPr>
-        <w:t>დიზაინი</w:t>
-      </w:r>
-      <w:r>
-        <w:rPr>
-          <w:sz w:val="24"/>
-          <w:szCs w:val="24"/>
-          <w:lang w:val="ka-GE"/>
-        </w:rPr>
-        <w:t xml:space="preserve"> შემდეგი მოდულებისთვის: </w:t>
-      </w:r>
-      <w:proofErr w:type="spellStart"/>
-      <w:r>
-        <w:rPr>
-          <w:sz w:val="24"/>
-          <w:szCs w:val="24"/>
-          <w:lang w:val="ka-GE"/>
-        </w:rPr>
-        <w:t>Sequencer</w:t>
-      </w:r>
-      <w:proofErr w:type="spellEnd"/>
-      <w:r>
-        <w:rPr>
-          <w:sz w:val="24"/>
-          <w:szCs w:val="24"/>
-          <w:lang w:val="ka-GE"/>
-        </w:rPr>
-        <w:t>, VCO.</w:t>
+        <w:t>Sequencer, VCO.</w:t>
       </w:r>
       <w:r>
         <w:rPr>
@@ -1090,6 +711,13 @@
     <w:bookmarkStart w:id="3" w:name="_Toc226930350" w:displacedByCustomXml="next"/>
     <w:sdt>
       <w:sdtPr>
+        <w:rPr>
+          <w:rFonts w:eastAsiaTheme="minorHAnsi" w:cstheme="minorBidi"/>
+          <w:b w:val="0"/>
+          <w:sz w:val="22"/>
+          <w:szCs w:val="22"/>
+          <w:lang/>
+        </w:rPr>
         <w:id w:val="-336457350"/>
         <w:docPartObj>
           <w:docPartGallery w:val="Table of Contents"/>
@@ -1098,12 +726,8 @@
       </w:sdtPr>
       <w:sdtEndPr>
         <w:rPr>
-          <w:rFonts w:eastAsiaTheme="minorHAnsi" w:cstheme="minorBidi"/>
           <w:bCs/>
           <w:noProof/>
-          <w:sz w:val="22"/>
-          <w:szCs w:val="22"/>
-          <w:lang w:val="en-150"/>
         </w:rPr>
       </w:sdtEndPr>
       <w:sdtContent>
@@ -1128,7 +752,7 @@
             <w:rPr>
               <w:rFonts w:asciiTheme="minorHAnsi" w:eastAsiaTheme="minorEastAsia" w:hAnsiTheme="minorHAnsi"/>
               <w:noProof/>
-              <w:lang w:eastAsia="en-150"/>
+              <w:lang/>
             </w:rPr>
           </w:pPr>
           <w:r>
@@ -1207,7 +831,7 @@
             <w:rPr>
               <w:rFonts w:asciiTheme="minorHAnsi" w:eastAsiaTheme="minorEastAsia" w:hAnsiTheme="minorHAnsi"/>
               <w:noProof/>
-              <w:lang w:eastAsia="en-150"/>
+              <w:lang/>
             </w:rPr>
           </w:pPr>
           <w:hyperlink w:anchor="_Toc226930350" w:history="1">
@@ -1277,7 +901,7 @@
             <w:rPr>
               <w:rFonts w:asciiTheme="minorHAnsi" w:eastAsiaTheme="minorEastAsia" w:hAnsiTheme="minorHAnsi"/>
               <w:noProof/>
-              <w:lang w:eastAsia="en-150"/>
+              <w:lang/>
             </w:rPr>
           </w:pPr>
           <w:hyperlink w:anchor="_Toc226930351" w:history="1">
@@ -1347,7 +971,7 @@
             <w:rPr>
               <w:rFonts w:asciiTheme="minorHAnsi" w:eastAsiaTheme="minorEastAsia" w:hAnsiTheme="minorHAnsi"/>
               <w:noProof/>
-              <w:lang w:eastAsia="en-150"/>
+              <w:lang/>
             </w:rPr>
           </w:pPr>
           <w:hyperlink w:anchor="_Toc226930352" w:history="1">
@@ -1417,7 +1041,7 @@
             <w:rPr>
               <w:rFonts w:asciiTheme="minorHAnsi" w:eastAsiaTheme="minorEastAsia" w:hAnsiTheme="minorHAnsi"/>
               <w:noProof/>
-              <w:lang w:eastAsia="en-150"/>
+              <w:lang/>
             </w:rPr>
           </w:pPr>
           <w:hyperlink w:anchor="_Toc226930353" w:history="1">
@@ -1487,7 +1111,7 @@
             <w:rPr>
               <w:rFonts w:asciiTheme="minorHAnsi" w:eastAsiaTheme="minorEastAsia" w:hAnsiTheme="minorHAnsi"/>
               <w:noProof/>
-              <w:lang w:eastAsia="en-150"/>
+              <w:lang/>
             </w:rPr>
           </w:pPr>
           <w:hyperlink w:anchor="_Toc226930354" w:history="1">
@@ -1558,7 +1182,7 @@
             <w:rPr>
               <w:rFonts w:asciiTheme="minorHAnsi" w:eastAsiaTheme="minorEastAsia" w:hAnsiTheme="minorHAnsi"/>
               <w:noProof/>
-              <w:lang w:eastAsia="en-150"/>
+              <w:lang/>
             </w:rPr>
           </w:pPr>
           <w:hyperlink w:anchor="_Toc226930355" w:history="1">
@@ -1629,7 +1253,7 @@
             <w:rPr>
               <w:rFonts w:asciiTheme="minorHAnsi" w:eastAsiaTheme="minorEastAsia" w:hAnsiTheme="minorHAnsi"/>
               <w:noProof/>
-              <w:lang w:eastAsia="en-150"/>
+              <w:lang/>
             </w:rPr>
           </w:pPr>
           <w:hyperlink w:anchor="_Toc226930356" w:history="1">
@@ -1700,7 +1324,7 @@
             <w:rPr>
               <w:rFonts w:asciiTheme="minorHAnsi" w:eastAsiaTheme="minorEastAsia" w:hAnsiTheme="minorHAnsi"/>
               <w:noProof/>
-              <w:lang w:eastAsia="en-150"/>
+              <w:lang/>
             </w:rPr>
           </w:pPr>
           <w:hyperlink w:anchor="_Toc226930357" w:history="1">
@@ -1771,7 +1395,7 @@
             <w:rPr>
               <w:rFonts w:asciiTheme="minorHAnsi" w:eastAsiaTheme="minorEastAsia" w:hAnsiTheme="minorHAnsi"/>
               <w:noProof/>
-              <w:lang w:eastAsia="en-150"/>
+              <w:lang/>
             </w:rPr>
           </w:pPr>
           <w:hyperlink w:anchor="_Toc226930358" w:history="1">
@@ -1841,7 +1465,7 @@
             <w:rPr>
               <w:rFonts w:asciiTheme="minorHAnsi" w:eastAsiaTheme="minorEastAsia" w:hAnsiTheme="minorHAnsi"/>
               <w:noProof/>
-              <w:lang w:eastAsia="en-150"/>
+              <w:lang/>
             </w:rPr>
           </w:pPr>
           <w:hyperlink w:anchor="_Toc226930359" w:history="1">
@@ -1911,7 +1535,7 @@
             <w:rPr>
               <w:rFonts w:asciiTheme="minorHAnsi" w:eastAsiaTheme="minorEastAsia" w:hAnsiTheme="minorHAnsi"/>
               <w:noProof/>
-              <w:lang w:eastAsia="en-150"/>
+              <w:lang/>
             </w:rPr>
           </w:pPr>
           <w:hyperlink w:anchor="_Toc226930360" w:history="1">
@@ -1981,7 +1605,7 @@
             <w:rPr>
               <w:rFonts w:asciiTheme="minorHAnsi" w:eastAsiaTheme="minorEastAsia" w:hAnsiTheme="minorHAnsi"/>
               <w:noProof/>
-              <w:lang w:eastAsia="en-150"/>
+              <w:lang/>
             </w:rPr>
           </w:pPr>
           <w:hyperlink w:anchor="_Toc226930361" w:history="1">
@@ -2051,7 +1675,7 @@
             <w:rPr>
               <w:rFonts w:asciiTheme="minorHAnsi" w:eastAsiaTheme="minorEastAsia" w:hAnsiTheme="minorHAnsi"/>
               <w:noProof/>
-              <w:lang w:eastAsia="en-150"/>
+              <w:lang/>
             </w:rPr>
           </w:pPr>
           <w:hyperlink w:anchor="_Toc226930362" w:history="1">
@@ -2158,7 +1782,7 @@
         <w:rPr>
           <w:rFonts w:asciiTheme="minorHAnsi" w:eastAsiaTheme="minorEastAsia" w:hAnsiTheme="minorHAnsi"/>
           <w:noProof/>
-          <w:lang w:eastAsia="en-150"/>
+          <w:lang/>
         </w:rPr>
       </w:pPr>
       <w:r>
@@ -2260,7 +1884,7 @@
         <w:rPr>
           <w:rFonts w:asciiTheme="minorHAnsi" w:eastAsiaTheme="minorEastAsia" w:hAnsiTheme="minorHAnsi"/>
           <w:noProof/>
-          <w:lang w:eastAsia="en-150"/>
+          <w:lang/>
         </w:rPr>
       </w:pPr>
       <w:hyperlink r:id="rId10" w:anchor="_Toc226930437" w:history="1">
@@ -2338,7 +1962,7 @@
         <w:rPr>
           <w:rFonts w:asciiTheme="minorHAnsi" w:eastAsiaTheme="minorEastAsia" w:hAnsiTheme="minorHAnsi"/>
           <w:noProof/>
-          <w:lang w:eastAsia="en-150"/>
+          <w:lang/>
         </w:rPr>
       </w:pPr>
       <w:hyperlink r:id="rId11" w:anchor="_Toc226930438" w:history="1">
@@ -2416,7 +2040,7 @@
         <w:rPr>
           <w:rFonts w:asciiTheme="minorHAnsi" w:eastAsiaTheme="minorEastAsia" w:hAnsiTheme="minorHAnsi"/>
           <w:noProof/>
-          <w:lang w:eastAsia="en-150"/>
+          <w:lang/>
         </w:rPr>
       </w:pPr>
       <w:hyperlink r:id="rId12" w:anchor="_Toc226930439" w:history="1">
@@ -2494,7 +2118,7 @@
         <w:rPr>
           <w:rFonts w:asciiTheme="minorHAnsi" w:eastAsiaTheme="minorEastAsia" w:hAnsiTheme="minorHAnsi"/>
           <w:noProof/>
-          <w:lang w:eastAsia="en-150"/>
+          <w:lang/>
         </w:rPr>
       </w:pPr>
       <w:hyperlink r:id="rId13" w:anchor="_Toc226930440" w:history="1">
@@ -2572,7 +2196,7 @@
         <w:rPr>
           <w:rFonts w:asciiTheme="minorHAnsi" w:eastAsiaTheme="minorEastAsia" w:hAnsiTheme="minorHAnsi"/>
           <w:noProof/>
-          <w:lang w:eastAsia="en-150"/>
+          <w:lang/>
         </w:rPr>
       </w:pPr>
       <w:hyperlink r:id="rId14" w:anchor="_Toc226930441" w:history="1">
@@ -2680,7 +2304,7 @@
         <w:rPr>
           <w:rFonts w:asciiTheme="minorHAnsi" w:eastAsiaTheme="minorEastAsia" w:hAnsiTheme="minorHAnsi"/>
           <w:noProof/>
-          <w:lang w:eastAsia="en-150"/>
+          <w:lang/>
         </w:rPr>
       </w:pPr>
       <w:hyperlink r:id="rId15" w:anchor="_Toc226930442" w:history="1">
@@ -2758,7 +2382,7 @@
         <w:rPr>
           <w:rFonts w:asciiTheme="minorHAnsi" w:eastAsiaTheme="minorEastAsia" w:hAnsiTheme="minorHAnsi"/>
           <w:noProof/>
-          <w:lang w:eastAsia="en-150"/>
+          <w:lang/>
         </w:rPr>
       </w:pPr>
       <w:hyperlink r:id="rId16" w:anchor="_Toc226930443" w:history="1">
@@ -2836,7 +2460,7 @@
         <w:rPr>
           <w:rFonts w:asciiTheme="minorHAnsi" w:eastAsiaTheme="minorEastAsia" w:hAnsiTheme="minorHAnsi"/>
           <w:noProof/>
-          <w:lang w:eastAsia="en-150"/>
+          <w:lang/>
         </w:rPr>
       </w:pPr>
       <w:hyperlink r:id="rId17" w:anchor="_Toc226930444" w:history="1">
@@ -2914,7 +2538,7 @@
         <w:rPr>
           <w:rFonts w:asciiTheme="minorHAnsi" w:eastAsiaTheme="minorEastAsia" w:hAnsiTheme="minorHAnsi"/>
           <w:noProof/>
-          <w:lang w:eastAsia="en-150"/>
+          <w:lang/>
         </w:rPr>
       </w:pPr>
       <w:hyperlink r:id="rId18" w:anchor="_Toc226930445" w:history="1">
@@ -2992,7 +2616,7 @@
         <w:rPr>
           <w:rFonts w:asciiTheme="minorHAnsi" w:eastAsiaTheme="minorEastAsia" w:hAnsiTheme="minorHAnsi"/>
           <w:noProof/>
-          <w:lang w:eastAsia="en-150"/>
+          <w:lang/>
         </w:rPr>
       </w:pPr>
       <w:hyperlink r:id="rId19" w:anchor="_Toc226930446" w:history="1">
@@ -3168,15 +2792,7 @@
           <w:szCs w:val="24"/>
           <w:lang w:val="sv-SE"/>
         </w:rPr>
-        <w:t>e</w:t>
-      </w:r>
-      <w:r>
-        <w:rPr>
-          <w:sz w:val="24"/>
-          <w:szCs w:val="24"/>
-          <w:lang w:val="sv-SE"/>
-        </w:rPr>
-        <w:t xml:space="preserve"> as the first one of the three assignments we were given. </w:t>
+        <w:t xml:space="preserve">e as the first one of the three assignments we were given. </w:t>
       </w:r>
       <w:r>
         <w:rPr>
@@ -3266,25 +2882,7 @@
           <w:szCs w:val="24"/>
           <w:lang w:val="en-US"/>
         </w:rPr>
-        <w:t xml:space="preserve">. A Voltage-Controlled Oscillator (VCO) is a module that can generate a periodic (oscillating) output signal of high frequency, which can be controlled by the input voltage. We have built a 1V/Octave Triangle &amp; Square wave VCO, meaning that a 1V increase in the input voltage doubles the frequency of the output voltage, and the two possible outputs of the module are a Triangular waveform and a </w:t>
-      </w:r>
-      <w:proofErr w:type="gramStart"/>
-      <w:r>
-        <w:rPr>
-          <w:sz w:val="24"/>
-          <w:szCs w:val="24"/>
-          <w:lang w:val="en-US"/>
-        </w:rPr>
-        <w:t>Square</w:t>
-      </w:r>
-      <w:proofErr w:type="gramEnd"/>
-      <w:r>
-        <w:rPr>
-          <w:sz w:val="24"/>
-          <w:szCs w:val="24"/>
-          <w:lang w:val="en-US"/>
-        </w:rPr>
-        <w:t xml:space="preserve"> waveform. </w:t>
+        <w:t xml:space="preserve">. A Voltage-Controlled Oscillator (VCO) is a module that can generate a periodic (oscillating) output signal of high frequency, which can be controlled by the input voltage. We have built a 1V/Octave Triangle &amp; Square wave VCO, meaning that a 1V increase in the input voltage doubles the frequency of the output voltage, and the two possible outputs of the module are a Triangular waveform and a Square waveform. </w:t>
       </w:r>
     </w:p>
     <w:p>
@@ -3367,6 +2965,9 @@
       <w:r>
         <w:rPr>
           <w:rStyle w:val="CommentReference"/>
+          <w:sz w:val="24"/>
+          <w:szCs w:val="24"/>
+          <w:lang w:val="en-US"/>
         </w:rPr>
         <w:commentReference w:id="6"/>
       </w:r>
@@ -3405,61 +3006,7 @@
           <w:szCs w:val="24"/>
           <w:lang w:val="en-US"/>
         </w:rPr>
-        <w:t xml:space="preserve">Along with physically building and soldering the modules on a </w:t>
-      </w:r>
-      <w:proofErr w:type="spellStart"/>
-      <w:r>
-        <w:rPr>
-          <w:sz w:val="24"/>
-          <w:szCs w:val="24"/>
-          <w:lang w:val="en-US"/>
-        </w:rPr>
-        <w:t>perfboard</w:t>
-      </w:r>
-      <w:proofErr w:type="spellEnd"/>
-      <w:r>
-        <w:rPr>
-          <w:sz w:val="24"/>
-          <w:szCs w:val="24"/>
-          <w:lang w:val="en-US"/>
-        </w:rPr>
-        <w:t>, we simulated their behavior in a SPICE program (</w:t>
-      </w:r>
-      <w:proofErr w:type="spellStart"/>
-      <w:r>
-        <w:rPr>
-          <w:sz w:val="24"/>
-          <w:szCs w:val="24"/>
-          <w:lang w:val="en-US"/>
-        </w:rPr>
-        <w:t>LTspice</w:t>
-      </w:r>
-      <w:proofErr w:type="spellEnd"/>
-      <w:r>
-        <w:rPr>
-          <w:sz w:val="24"/>
-          <w:szCs w:val="24"/>
-          <w:lang w:val="en-US"/>
-        </w:rPr>
-        <w:t xml:space="preserve">) and designed a ready-for-printing PCB layout. These files can be found on out </w:t>
-      </w:r>
-      <w:proofErr w:type="spellStart"/>
-      <w:r>
-        <w:rPr>
-          <w:sz w:val="24"/>
-          <w:szCs w:val="24"/>
-          <w:lang w:val="en-US"/>
-        </w:rPr>
-        <w:t>github</w:t>
-      </w:r>
-      <w:proofErr w:type="spellEnd"/>
-      <w:r>
-        <w:rPr>
-          <w:sz w:val="24"/>
-          <w:szCs w:val="24"/>
-          <w:lang w:val="en-US"/>
-        </w:rPr>
-        <w:t xml:space="preserve"> repository linked at the end of this report.  </w:t>
+        <w:t xml:space="preserve">Along with physically building and soldering the modules on a perfboard, we simulated their behavior in a SPICE program (LTspice) and designed a ready-for-printing PCB layout. These files can be found on out github repository linked at the end of this report.  </w:t>
       </w:r>
     </w:p>
     <w:p>
@@ -4201,6 +3748,10 @@
       <w:r>
         <w:rPr>
           <w:rStyle w:val="CommentReference"/>
+          <w:rFonts w:eastAsiaTheme="minorEastAsia"/>
+          <w:sz w:val="24"/>
+          <w:szCs w:val="24"/>
+          <w:lang w:val="en-US"/>
         </w:rPr>
         <w:commentReference w:id="9"/>
       </w:r>
@@ -4291,27 +3842,7 @@
           <w:szCs w:val="24"/>
           <w:lang w:val="en-US"/>
         </w:rPr>
-        <w:t xml:space="preserve"> The simulation operates as expected; the schematic diagram of the module matches the actual build on a </w:t>
-      </w:r>
-      <w:proofErr w:type="spellStart"/>
-      <w:r>
-        <w:rPr>
-          <w:rFonts w:eastAsiaTheme="minorEastAsia"/>
-          <w:sz w:val="24"/>
-          <w:szCs w:val="24"/>
-          <w:lang w:val="en-US"/>
-        </w:rPr>
-        <w:t>Perfboard</w:t>
-      </w:r>
-      <w:proofErr w:type="spellEnd"/>
-      <w:r>
-        <w:rPr>
-          <w:rFonts w:eastAsiaTheme="minorEastAsia"/>
-          <w:sz w:val="24"/>
-          <w:szCs w:val="24"/>
-          <w:lang w:val="en-US"/>
-        </w:rPr>
-        <w:t>, and a PCB layout is present.</w:t>
+        <w:t xml:space="preserve"> The simulation operates as expected; the schematic diagram of the module matches the actual build on a Perfboard, and a PCB layout is present.</w:t>
       </w:r>
     </w:p>
     <w:p>
@@ -4631,6 +4162,9 @@
       <w:r>
         <w:rPr>
           <w:rStyle w:val="CommentReference"/>
+          <w:sz w:val="24"/>
+          <w:szCs w:val="24"/>
+          <w:lang w:val="en-US"/>
         </w:rPr>
         <w:commentReference w:id="11"/>
       </w:r>
@@ -4769,25 +4303,7 @@
           <w:szCs w:val="24"/>
           <w:lang w:val="en-US"/>
         </w:rPr>
-        <w:t xml:space="preserve">In the linear-to-exponential converter part of the module, two </w:t>
-      </w:r>
-      <w:proofErr w:type="spellStart"/>
-      <w:r>
-        <w:rPr>
-          <w:sz w:val="24"/>
-          <w:szCs w:val="24"/>
-          <w:lang w:val="en-US"/>
-        </w:rPr>
-        <w:t>npn</w:t>
-      </w:r>
-      <w:proofErr w:type="spellEnd"/>
-      <w:r>
-        <w:rPr>
-          <w:sz w:val="24"/>
-          <w:szCs w:val="24"/>
-          <w:lang w:val="en-US"/>
-        </w:rPr>
-        <w:t xml:space="preserve"> BJT transistors (Q1 &amp; Q2) form a differential pair, whose emitters are joint. </w:t>
+        <w:t xml:space="preserve">In the linear-to-exponential converter part of the module, two npn BJT transistors (Q1 &amp; Q2) form a differential pair, whose emitters are joint. </w:t>
       </w:r>
       <w:r>
         <w:rPr>
@@ -5283,6 +4799,10 @@
       <w:r>
         <w:rPr>
           <w:rStyle w:val="CommentReference"/>
+          <w:rFonts w:eastAsiaTheme="minorEastAsia"/>
+          <w:sz w:val="24"/>
+          <w:szCs w:val="24"/>
+          <w:lang w:val="en-US"/>
         </w:rPr>
         <w:commentReference w:id="12"/>
       </w:r>
@@ -5324,27 +4844,7 @@
           <w:szCs w:val="24"/>
           <w:lang w:val="en-US"/>
         </w:rPr>
-        <w:t xml:space="preserve">The collectors of Q1 </w:t>
-      </w:r>
-      <w:proofErr w:type="gramStart"/>
-      <w:r>
-        <w:rPr>
-          <w:rFonts w:eastAsiaTheme="minorEastAsia"/>
-          <w:sz w:val="24"/>
-          <w:szCs w:val="24"/>
-          <w:lang w:val="en-US"/>
-        </w:rPr>
-        <w:t>is</w:t>
-      </w:r>
-      <w:proofErr w:type="gramEnd"/>
-      <w:r>
-        <w:rPr>
-          <w:rFonts w:eastAsiaTheme="minorEastAsia"/>
-          <w:sz w:val="24"/>
-          <w:szCs w:val="24"/>
-          <w:lang w:val="en-US"/>
-        </w:rPr>
-        <w:t xml:space="preserve"> connected to an op-amp’s inverting input, which is also connected to V+ through 1M</w:t>
+        <w:t>The collectors of Q1 is connected to an op-amp’s inverting input, which is also connected to V+ through 1M</w:t>
       </w:r>
       <w:r>
         <w:rPr>
@@ -5535,6 +5035,10 @@
       <w:r>
         <w:rPr>
           <w:rStyle w:val="CommentReference"/>
+          <w:rFonts w:eastAsiaTheme="minorEastAsia"/>
+          <w:sz w:val="24"/>
+          <w:szCs w:val="24"/>
+          <w:lang w:val="en-US"/>
         </w:rPr>
         <w:commentReference w:id="13"/>
       </w:r>
@@ -5595,27 +5099,7 @@
           <w:lang w:val="en-US"/>
         </w:rPr>
         <w:lastRenderedPageBreak/>
-        <w:t xml:space="preserve">All aforementioned requirements were met: the module successfully generates two stable waveforms (Triangle and Square), a 1V change in the CV corresponds to 1 Octave change, having a trimming potentiometer allowing for manual correction of the pitch, and the module maintains a stable tonal range for several minutes. The simulation operates as expected; the schematic diagram of the module matches the actual build on a </w:t>
-      </w:r>
-      <w:proofErr w:type="spellStart"/>
-      <w:r>
-        <w:rPr>
-          <w:rFonts w:eastAsiaTheme="minorEastAsia"/>
-          <w:sz w:val="24"/>
-          <w:szCs w:val="24"/>
-          <w:lang w:val="en-US"/>
-        </w:rPr>
-        <w:t>Perfboard</w:t>
-      </w:r>
-      <w:proofErr w:type="spellEnd"/>
-      <w:r>
-        <w:rPr>
-          <w:rFonts w:eastAsiaTheme="minorEastAsia"/>
-          <w:sz w:val="24"/>
-          <w:szCs w:val="24"/>
-          <w:lang w:val="en-US"/>
-        </w:rPr>
-        <w:t>, and a PCB layout is present.</w:t>
+        <w:t>All aforementioned requirements were met: the module successfully generates two stable waveforms (Triangle and Square), a 1V change in the CV corresponds to 1 Octave change, having a trimming potentiometer allowing for manual correction of the pitch, and the module maintains a stable tonal range for several minutes. The simulation operates as expected; the schematic diagram of the module matches the actual build on a Perfboard, and a PCB layout is present.</w:t>
       </w:r>
     </w:p>
     <w:p>
@@ -5899,27 +5383,7 @@
           <w:szCs w:val="24"/>
           <w:lang w:val="en-US"/>
         </w:rPr>
-        <w:t xml:space="preserve"> Differential Amplifier”. The core of the design is to use the gain of a bipolar transistor to control the amplitude of the input signal. The core part of the design is two </w:t>
-      </w:r>
-      <w:proofErr w:type="spellStart"/>
-      <w:r>
-        <w:rPr>
-          <w:rFonts w:eastAsiaTheme="minorEastAsia"/>
-          <w:sz w:val="24"/>
-          <w:szCs w:val="24"/>
-          <w:lang w:val="en-US"/>
-        </w:rPr>
-        <w:t>npn</w:t>
-      </w:r>
-      <w:proofErr w:type="spellEnd"/>
-      <w:r>
-        <w:rPr>
-          <w:rFonts w:eastAsiaTheme="minorEastAsia"/>
-          <w:sz w:val="24"/>
-          <w:szCs w:val="24"/>
-          <w:lang w:val="en-US"/>
-        </w:rPr>
-        <w:t xml:space="preserve"> transistors with joint emitters (Q7 &amp; Q8). It is essential for them to be as close to each other as possible in the real build to ensure that they operate at the same temperature and </w:t>
+        <w:t xml:space="preserve"> Differential Amplifier”. The core of the design is to use the gain of a bipolar transistor to control the amplitude of the input signal. The core part of the design is two npn transistors with joint emitters (Q7 &amp; Q8). It is essential for them to be as close to each other as possible in the real build to ensure that they operate at the same temperature and </w:t>
       </w:r>
       <w:r>
         <w:rPr>
@@ -5978,6 +5442,9 @@
       <w:r>
         <w:rPr>
           <w:rStyle w:val="CommentReference"/>
+          <w:sz w:val="24"/>
+          <w:szCs w:val="24"/>
+          <w:lang w:val="en-US"/>
         </w:rPr>
         <w:commentReference w:id="15"/>
       </w:r>
@@ -6113,27 +5580,7 @@
           <w:szCs w:val="24"/>
           <w:lang w:val="en-US"/>
         </w:rPr>
-        <w:t xml:space="preserve">The Control Voltage (CV) first goes through a 100k potentiometer to allow for manual adjustment, and is then connected to the inverting input of an op-amp configured as an inverting amplifier/buffer, by connecting its non-inverting input to ground and </w:t>
-      </w:r>
-      <w:proofErr w:type="gramStart"/>
-      <w:r>
-        <w:rPr>
-          <w:rFonts w:eastAsiaTheme="minorEastAsia"/>
-          <w:sz w:val="24"/>
-          <w:szCs w:val="24"/>
-          <w:lang w:val="en-US"/>
-        </w:rPr>
-        <w:t>its</w:t>
-      </w:r>
-      <w:proofErr w:type="gramEnd"/>
-      <w:r>
-        <w:rPr>
-          <w:rFonts w:eastAsiaTheme="minorEastAsia"/>
-          <w:sz w:val="24"/>
-          <w:szCs w:val="24"/>
-          <w:lang w:val="en-US"/>
-        </w:rPr>
-        <w:t xml:space="preserve"> output to its inverting input through a 100k resistor. The output is connected to the joint emitters of Q7 and Q8 through a 47k resistor. </w:t>
+        <w:t xml:space="preserve">The Control Voltage (CV) first goes through a 100k potentiometer to allow for manual adjustment, and is then connected to the inverting input of an op-amp configured as an inverting amplifier/buffer, by connecting its non-inverting input to ground and its output to its inverting input through a 100k resistor. The output is connected to the joint emitters of Q7 and Q8 through a 47k resistor. </w:t>
       </w:r>
       <w:r>
         <w:rPr>
@@ -6211,27 +5658,7 @@
           <w:szCs w:val="24"/>
           <w:lang w:val="en-US"/>
         </w:rPr>
-        <w:t xml:space="preserve">signal is an amplified version of the input signal with DC offset removed, making it ready for a mixer or final output. The amplification can also be manually controlled independently of CV via a 100k potentiometer. We built this module on a </w:t>
-      </w:r>
-      <w:proofErr w:type="spellStart"/>
-      <w:r>
-        <w:rPr>
-          <w:rFonts w:eastAsiaTheme="minorEastAsia"/>
-          <w:sz w:val="24"/>
-          <w:szCs w:val="24"/>
-          <w:lang w:val="en-US"/>
-        </w:rPr>
-        <w:t>perfboard</w:t>
-      </w:r>
-      <w:proofErr w:type="spellEnd"/>
-      <w:r>
-        <w:rPr>
-          <w:rFonts w:eastAsiaTheme="minorEastAsia"/>
-          <w:sz w:val="24"/>
-          <w:szCs w:val="24"/>
-          <w:lang w:val="en-US"/>
-        </w:rPr>
-        <w:t xml:space="preserve"> with audio jack ports for the input, output and CV and a </w:t>
+        <w:t xml:space="preserve">signal is an amplified version of the input signal with DC offset removed, making it ready for a mixer or final output. The amplification can also be manually controlled independently of CV via a 100k potentiometer. We built this module on a perfboard with audio jack ports for the input, output and CV and a </w:t>
       </w:r>
       <w:r>
         <w:rPr>
@@ -6265,6 +5692,10 @@
       <w:r>
         <w:rPr>
           <w:rStyle w:val="CommentReference"/>
+          <w:rFonts w:eastAsiaTheme="minorEastAsia"/>
+          <w:sz w:val="24"/>
+          <w:szCs w:val="24"/>
+          <w:lang w:val="en-US"/>
         </w:rPr>
         <w:commentReference w:id="16"/>
       </w:r>
@@ -6812,27 +6243,7 @@
           <w:szCs w:val="24"/>
           <w:lang w:val="en-US"/>
         </w:rPr>
-        <w:t xml:space="preserve">We built this module on a </w:t>
-      </w:r>
-      <w:proofErr w:type="spellStart"/>
-      <w:r>
-        <w:rPr>
-          <w:rFonts w:eastAsiaTheme="minorEastAsia"/>
-          <w:sz w:val="24"/>
-          <w:szCs w:val="24"/>
-          <w:lang w:val="en-US"/>
-        </w:rPr>
-        <w:t>perfboard</w:t>
-      </w:r>
-      <w:proofErr w:type="spellEnd"/>
-      <w:r>
-        <w:rPr>
-          <w:rFonts w:eastAsiaTheme="minorEastAsia"/>
-          <w:sz w:val="24"/>
-          <w:szCs w:val="24"/>
-          <w:lang w:val="en-US"/>
-        </w:rPr>
-        <w:t xml:space="preserve"> with audio jack ports for the input</w:t>
+        <w:t>We built this module on a perfboard with audio jack ports for the input</w:t>
       </w:r>
       <w:r>
         <w:rPr>
@@ -6920,6 +6331,10 @@
       <w:r>
         <w:rPr>
           <w:rStyle w:val="CommentReference"/>
+          <w:rFonts w:eastAsiaTheme="minorEastAsia"/>
+          <w:sz w:val="24"/>
+          <w:szCs w:val="24"/>
+          <w:lang w:val="en-US"/>
         </w:rPr>
         <w:commentReference w:id="18"/>
       </w:r>
@@ -6964,27 +6379,7 @@
           <w:szCs w:val="24"/>
           <w:lang w:val="en-US"/>
         </w:rPr>
-        <w:t xml:space="preserve">All of the requirements set for each individual module were met. We built and soldered all of the modules onto a </w:t>
-      </w:r>
-      <w:proofErr w:type="spellStart"/>
-      <w:r>
-        <w:rPr>
-          <w:rFonts w:eastAsiaTheme="minorEastAsia"/>
-          <w:sz w:val="24"/>
-          <w:szCs w:val="24"/>
-          <w:lang w:val="en-US"/>
-        </w:rPr>
-        <w:t>perfboard</w:t>
-      </w:r>
-      <w:proofErr w:type="spellEnd"/>
-      <w:r>
-        <w:rPr>
-          <w:rFonts w:eastAsiaTheme="minorEastAsia"/>
-          <w:sz w:val="24"/>
-          <w:szCs w:val="24"/>
-          <w:lang w:val="en-US"/>
-        </w:rPr>
-        <w:t xml:space="preserve">, using TL072 and TL074 for op-amps, SE555 for the timer and CD4017BE for the decade counter in the sequencer, </w:t>
+        <w:t xml:space="preserve">All of the requirements set for each individual module were met. We built and soldered all of the modules onto a perfboard, using TL072 and TL074 for op-amps, SE555 for the timer and CD4017BE for the decade counter in the sequencer, </w:t>
       </w:r>
       <w:r>
         <w:rPr>
@@ -7038,27 +6433,7 @@
           <w:szCs w:val="24"/>
           <w:lang w:val="en-US"/>
         </w:rPr>
-        <w:t xml:space="preserve">s for single and dual power supply accordingly and IC sockets, allowing for easy replacement of the IC chips without the need for de-soldering. made the schematic design and simulated each module in SPICE before building a prototype on a </w:t>
-      </w:r>
-      <w:proofErr w:type="spellStart"/>
-      <w:r>
-        <w:rPr>
-          <w:rFonts w:eastAsiaTheme="minorEastAsia"/>
-          <w:sz w:val="24"/>
-          <w:szCs w:val="24"/>
-          <w:lang w:val="en-US"/>
-        </w:rPr>
-        <w:t>Perfboard</w:t>
-      </w:r>
-      <w:proofErr w:type="spellEnd"/>
-      <w:r>
-        <w:rPr>
-          <w:rFonts w:eastAsiaTheme="minorEastAsia"/>
-          <w:sz w:val="24"/>
-          <w:szCs w:val="24"/>
-          <w:lang w:val="en-US"/>
-        </w:rPr>
-        <w:t xml:space="preserve">, then, after making sure it functions as expected, designed a PCB layout ready for printing thus proving our </w:t>
+        <w:t xml:space="preserve">s for single and dual power supply accordingly and IC sockets, allowing for easy replacement of the IC chips without the need for de-soldering. made the schematic design and simulated each module in SPICE before building a prototype on a Perfboard, then, after making sure it functions as expected, designed a PCB layout ready for printing thus proving our </w:t>
       </w:r>
       <w:r>
         <w:rPr>
@@ -7261,6 +6636,44 @@
           <w:szCs w:val="24"/>
           <w:lang w:val="en-US"/>
         </w:rPr>
+        <w:t>Assembled module testing</w:t>
+      </w:r>
+      <w:r>
+        <w:rPr>
+          <w:rFonts w:eastAsiaTheme="minorEastAsia"/>
+          <w:sz w:val="24"/>
+          <w:szCs w:val="24"/>
+          <w:lang w:val="en-US"/>
+        </w:rPr>
+        <w:t xml:space="preserve"> </w:t>
+      </w:r>
+      <w:r>
+        <w:t>&amp; Verification</w:t>
+      </w:r>
+    </w:p>
+    <w:p>
+      <w:pPr>
+        <w:pStyle w:val="ListParagraph"/>
+        <w:numPr>
+          <w:ilvl w:val="0"/>
+          <w:numId w:val="18"/>
+        </w:numPr>
+        <w:spacing w:line="360" w:lineRule="auto"/>
+        <w:jc w:val="both"/>
+        <w:rPr>
+          <w:rFonts w:eastAsiaTheme="minorEastAsia"/>
+          <w:sz w:val="24"/>
+          <w:szCs w:val="24"/>
+          <w:lang w:val="en-US"/>
+        </w:rPr>
+      </w:pPr>
+      <w:r>
+        <w:rPr>
+          <w:rFonts w:eastAsiaTheme="minorEastAsia"/>
+          <w:sz w:val="24"/>
+          <w:szCs w:val="24"/>
+          <w:lang w:val="en-US"/>
+        </w:rPr>
         <w:t>Project Report Writing</w:t>
       </w:r>
     </w:p>
@@ -7277,7 +6690,6 @@
           <w:lang w:val="en-US"/>
         </w:rPr>
       </w:pPr>
-      <w:proofErr w:type="spellStart"/>
       <w:r>
         <w:rPr>
           <w:rFonts w:eastAsiaTheme="minorEastAsia"/>
@@ -7287,43 +6699,7 @@
           <w:szCs w:val="24"/>
           <w:lang w:val="en-US"/>
         </w:rPr>
-        <w:t>Ketevani</w:t>
-      </w:r>
-      <w:proofErr w:type="spellEnd"/>
-      <w:r>
-        <w:rPr>
-          <w:rFonts w:eastAsiaTheme="minorEastAsia"/>
-          <w:b/>
-          <w:bCs/>
-          <w:sz w:val="24"/>
-          <w:szCs w:val="24"/>
-          <w:lang w:val="en-US"/>
-        </w:rPr>
-        <w:t xml:space="preserve"> </w:t>
-      </w:r>
-      <w:proofErr w:type="spellStart"/>
-      <w:r>
-        <w:rPr>
-          <w:rFonts w:eastAsiaTheme="minorEastAsia"/>
-          <w:b/>
-          <w:bCs/>
-          <w:sz w:val="24"/>
-          <w:szCs w:val="24"/>
-          <w:lang w:val="en-US"/>
-        </w:rPr>
-        <w:t>Tskhvedadze</w:t>
-      </w:r>
-      <w:proofErr w:type="spellEnd"/>
-      <w:r>
-        <w:rPr>
-          <w:rFonts w:eastAsiaTheme="minorEastAsia"/>
-          <w:b/>
-          <w:bCs/>
-          <w:sz w:val="24"/>
-          <w:szCs w:val="24"/>
-          <w:lang w:val="en-US"/>
-        </w:rPr>
-        <w:t>:</w:t>
+        <w:t>Ketevani Tskhvedadze:</w:t>
       </w:r>
     </w:p>
     <w:p>
@@ -7480,6 +6856,35 @@
           <w:lang w:val="en-US"/>
         </w:rPr>
         <w:t>Physical Assembly</w:t>
+      </w:r>
+    </w:p>
+    <w:p>
+      <w:pPr>
+        <w:pStyle w:val="ListParagraph"/>
+        <w:numPr>
+          <w:ilvl w:val="0"/>
+          <w:numId w:val="20"/>
+        </w:numPr>
+        <w:spacing w:line="360" w:lineRule="auto"/>
+        <w:jc w:val="both"/>
+        <w:rPr>
+          <w:rFonts w:eastAsiaTheme="minorEastAsia"/>
+          <w:sz w:val="24"/>
+          <w:szCs w:val="24"/>
+          <w:lang w:val="en-US"/>
+        </w:rPr>
+      </w:pPr>
+      <w:r>
+        <w:t>GitHub Repository Management</w:t>
+      </w:r>
+      <w:r>
+        <w:rPr>
+          <w:lang w:val="en-US"/>
+        </w:rPr>
+        <w:t xml:space="preserve"> </w:t>
+      </w:r>
+      <w:r>
+        <w:t>&amp; Documentation</w:t>
       </w:r>
     </w:p>
     <w:p>
@@ -7620,33 +7025,11 @@
           <w:lang w:val="ka-GE"/>
         </w:rPr>
       </w:pPr>
-      <w:proofErr w:type="spellStart"/>
-      <w:r>
-        <w:rPr>
-          <w:lang w:val="en-US"/>
-        </w:rPr>
-        <w:t>Ketevani</w:t>
-      </w:r>
-      <w:proofErr w:type="spellEnd"/>
-      <w:r>
-        <w:rPr>
-          <w:lang w:val="en-US"/>
-        </w:rPr>
-        <w:t xml:space="preserve"> </w:t>
-      </w:r>
-      <w:proofErr w:type="spellStart"/>
-      <w:r>
-        <w:rPr>
-          <w:lang w:val="en-US"/>
-        </w:rPr>
-        <w:t>Tskhvedadze</w:t>
-      </w:r>
-      <w:proofErr w:type="spellEnd"/>
-      <w:r>
-        <w:rPr>
-          <w:lang w:val="en-US"/>
-        </w:rPr>
-        <w:t xml:space="preserve"> - </w:t>
+      <w:r>
+        <w:rPr>
+          <w:lang w:val="en-US"/>
+        </w:rPr>
+        <w:t xml:space="preserve">Ketevani Tskhvedadze - </w:t>
       </w:r>
       <w:hyperlink r:id="rId28" w:history="1">
         <w:r>
@@ -7660,15 +7043,6 @@
     </w:p>
     <w:p>
       <w:pPr>
-        <w:ind w:firstLine="720"/>
-        <w:jc w:val="both"/>
-        <w:rPr>
-          <w:lang w:val="ka-GE"/>
-        </w:rPr>
-      </w:pPr>
-    </w:p>
-    <w:p>
-      <w:pPr>
         <w:spacing w:line="360" w:lineRule="auto"/>
         <w:jc w:val="both"/>
         <w:rPr>
@@ -7822,21 +7196,7 @@
         <w:rPr>
           <w:rFonts w:ascii="Sylfaen" w:hAnsi="Sylfaen"/>
         </w:rPr>
-        <w:t xml:space="preserve">[4] "TL074 Datasheet," </w:t>
-      </w:r>
-      <w:proofErr w:type="spellStart"/>
-      <w:r>
-        <w:rPr>
-          <w:rFonts w:ascii="Sylfaen" w:hAnsi="Sylfaen"/>
-        </w:rPr>
-        <w:t>Alldatasheet</w:t>
-      </w:r>
-      <w:proofErr w:type="spellEnd"/>
-      <w:r>
-        <w:rPr>
-          <w:rFonts w:ascii="Sylfaen" w:hAnsi="Sylfaen"/>
-        </w:rPr>
-        <w:t xml:space="preserve">. [Online]. Available: </w:t>
+        <w:t xml:space="preserve">[4] "TL074 Datasheet," Alldatasheet. [Online]. Available: </w:t>
       </w:r>
       <w:hyperlink r:id="rId32" w:tgtFrame="_blank" w:history="1">
         <w:r>
@@ -7942,7 +7302,6 @@
         </w:rPr>
         <w:t xml:space="preserve">[6] E. Winer, "Building a Guitar-Controlled Synthesizer: VCA &amp; VCF," </w:t>
       </w:r>
-      <w:proofErr w:type="spellStart"/>
       <w:r>
         <w:rPr>
           <w:rStyle w:val="citation-4"/>
@@ -7952,7 +7311,6 @@
         </w:rPr>
         <w:t>audioXpress</w:t>
       </w:r>
-      <w:proofErr w:type="spellEnd"/>
       <w:r>
         <w:rPr>
           <w:rStyle w:val="citation-4"/>
@@ -8095,12 +7453,12 @@
         <w:br w:type="page"/>
       </w:r>
     </w:p>
+    <w:bookmarkStart w:id="23" w:name="_Toc226930362"/>
     <w:p>
       <w:pPr>
         <w:pStyle w:val="Heading1"/>
         <w:spacing w:line="360" w:lineRule="auto"/>
       </w:pPr>
-      <w:bookmarkStart w:id="23" w:name="_Toc226930362"/>
       <w:r>
         <w:rPr>
           <w:noProof/>
@@ -8158,24 +7516,14 @@
                             <w:r>
                               <w:t xml:space="preserve">Figure </w:t>
                             </w:r>
-                            <w:r>
-                              <w:fldChar w:fldCharType="begin"/>
-                            </w:r>
-                            <w:r>
-                              <w:instrText xml:space="preserve"> SEQ Figure \* ARABIC </w:instrText>
-                            </w:r>
-                            <w:r>
-                              <w:fldChar w:fldCharType="separate"/>
-                            </w:r>
-                            <w:r>
-                              <w:rPr>
-                                <w:noProof/>
-                              </w:rPr>
-                              <w:t>1</w:t>
-                            </w:r>
-                            <w:r>
-                              <w:fldChar w:fldCharType="end"/>
-                            </w:r>
+                            <w:fldSimple w:instr=" SEQ Figure \* ARABIC ">
+                              <w:r>
+                                <w:rPr>
+                                  <w:noProof/>
+                                </w:rPr>
+                                <w:t>1</w:t>
+                              </w:r>
+                            </w:fldSimple>
                             <w:r>
                               <w:rPr>
                                 <w:lang w:val="en-US"/>
@@ -8395,29 +7743,19 @@
                                 <w:szCs w:val="24"/>
                               </w:rPr>
                             </w:pPr>
-                            <w:bookmarkStart w:id="28" w:name="_Toc226928227"/>
-                            <w:bookmarkStart w:id="29" w:name="_Toc226930437"/>
+                            <w:bookmarkStart w:id="26" w:name="_Toc226928227"/>
+                            <w:bookmarkStart w:id="27" w:name="_Toc226930437"/>
                             <w:r>
                               <w:t xml:space="preserve">Figure </w:t>
                             </w:r>
-                            <w:r>
-                              <w:fldChar w:fldCharType="begin"/>
-                            </w:r>
-                            <w:r>
-                              <w:instrText xml:space="preserve"> SEQ Figure \* ARABIC </w:instrText>
-                            </w:r>
-                            <w:r>
-                              <w:fldChar w:fldCharType="separate"/>
-                            </w:r>
-                            <w:r>
-                              <w:rPr>
-                                <w:noProof/>
-                              </w:rPr>
-                              <w:t>2</w:t>
-                            </w:r>
-                            <w:r>
-                              <w:fldChar w:fldCharType="end"/>
-                            </w:r>
+                            <w:fldSimple w:instr=" SEQ Figure \* ARABIC ">
+                              <w:r>
+                                <w:rPr>
+                                  <w:noProof/>
+                                </w:rPr>
+                                <w:t>2</w:t>
+                              </w:r>
+                            </w:fldSimple>
                             <w:r>
                               <w:rPr>
                                 <w:lang w:val="en-US"/>
@@ -8436,8 +7774,8 @@
                               </w:rPr>
                               <w:t>.</w:t>
                             </w:r>
-                            <w:bookmarkEnd w:id="28"/>
-                            <w:bookmarkEnd w:id="29"/>
+                            <w:bookmarkEnd w:id="26"/>
+                            <w:bookmarkEnd w:id="27"/>
                           </w:p>
                         </w:txbxContent>
                       </wps:txbx>
@@ -8525,7 +7863,7 @@
           <w:noProof/>
         </w:rPr>
         <w:drawing>
-          <wp:anchor distT="0" distB="0" distL="114300" distR="114300" simplePos="0" relativeHeight="251672576" behindDoc="0" locked="0" layoutInCell="1" allowOverlap="1" wp14:anchorId="08886D7E" wp14:editId="24E4B9DA">
+          <wp:anchor distT="0" distB="0" distL="114300" distR="114300" simplePos="0" relativeHeight="251672576" behindDoc="0" locked="0" layoutInCell="1" allowOverlap="1" wp14:anchorId="08886D7E" wp14:editId="355D0F6A">
             <wp:simplePos x="0" y="0"/>
             <wp:positionH relativeFrom="margin">
               <wp:align>right</wp:align>
@@ -8677,37 +8015,27 @@
                                 <w:lang w:val="en-US"/>
                               </w:rPr>
                             </w:pPr>
-                            <w:bookmarkStart w:id="32" w:name="_Toc226928228"/>
-                            <w:bookmarkStart w:id="33" w:name="_Toc226930438"/>
+                            <w:bookmarkStart w:id="28" w:name="_Toc226928228"/>
+                            <w:bookmarkStart w:id="29" w:name="_Toc226930438"/>
                             <w:r>
                               <w:t xml:space="preserve">Figure </w:t>
                             </w:r>
-                            <w:r>
-                              <w:fldChar w:fldCharType="begin"/>
-                            </w:r>
-                            <w:r>
-                              <w:instrText xml:space="preserve"> SEQ Figure \* ARABIC </w:instrText>
-                            </w:r>
-                            <w:r>
-                              <w:fldChar w:fldCharType="separate"/>
-                            </w:r>
-                            <w:r>
-                              <w:rPr>
-                                <w:noProof/>
-                              </w:rPr>
-                              <w:t>3</w:t>
-                            </w:r>
-                            <w:r>
-                              <w:fldChar w:fldCharType="end"/>
-                            </w:r>
+                            <w:fldSimple w:instr=" SEQ Figure \* ARABIC ">
+                              <w:r>
+                                <w:rPr>
+                                  <w:noProof/>
+                                </w:rPr>
+                                <w:t>3</w:t>
+                              </w:r>
+                            </w:fldSimple>
                             <w:r>
                               <w:rPr>
                                 <w:lang w:val="en-US"/>
                               </w:rPr>
                               <w:t>: VCO. Schematic Design.</w:t>
                             </w:r>
-                            <w:bookmarkEnd w:id="32"/>
-                            <w:bookmarkEnd w:id="33"/>
+                            <w:bookmarkEnd w:id="28"/>
+                            <w:bookmarkEnd w:id="29"/>
                           </w:p>
                         </w:txbxContent>
                       </wps:txbx>
@@ -8940,7 +8268,7 @@
         </w:rPr>
         <w:lastRenderedPageBreak/>
         <w:drawing>
-          <wp:anchor distT="0" distB="0" distL="114300" distR="114300" simplePos="0" relativeHeight="251666432" behindDoc="0" locked="0" layoutInCell="1" allowOverlap="1" wp14:anchorId="3201C40E" wp14:editId="77030DD2">
+          <wp:anchor distT="0" distB="0" distL="114300" distR="114300" simplePos="0" relativeHeight="251666432" behindDoc="0" locked="0" layoutInCell="1" allowOverlap="1" wp14:anchorId="3201C40E" wp14:editId="51012E61">
             <wp:simplePos x="0" y="0"/>
             <wp:positionH relativeFrom="margin">
               <wp:posOffset>-1270</wp:posOffset>
@@ -9074,37 +8402,27 @@
                                 <w:szCs w:val="24"/>
                               </w:rPr>
                             </w:pPr>
-                            <w:bookmarkStart w:id="36" w:name="_Toc226928229"/>
-                            <w:bookmarkStart w:id="37" w:name="_Toc226930439"/>
+                            <w:bookmarkStart w:id="30" w:name="_Toc226928229"/>
+                            <w:bookmarkStart w:id="31" w:name="_Toc226930439"/>
                             <w:r>
                               <w:t xml:space="preserve">Figure </w:t>
                             </w:r>
-                            <w:r>
-                              <w:fldChar w:fldCharType="begin"/>
-                            </w:r>
-                            <w:r>
-                              <w:instrText xml:space="preserve"> SEQ Figure \* ARABIC </w:instrText>
-                            </w:r>
-                            <w:r>
-                              <w:fldChar w:fldCharType="separate"/>
-                            </w:r>
-                            <w:r>
-                              <w:rPr>
-                                <w:noProof/>
-                              </w:rPr>
-                              <w:t>4</w:t>
-                            </w:r>
-                            <w:r>
-                              <w:fldChar w:fldCharType="end"/>
-                            </w:r>
+                            <w:fldSimple w:instr=" SEQ Figure \* ARABIC ">
+                              <w:r>
+                                <w:rPr>
+                                  <w:noProof/>
+                                </w:rPr>
+                                <w:t>4</w:t>
+                              </w:r>
+                            </w:fldSimple>
                             <w:r>
                               <w:rPr>
                                 <w:lang w:val="en-US"/>
                               </w:rPr>
                               <w:t>: The linear input (black) of a VCO being transformed to exponential (blue) by the linear-to-exponential converter.</w:t>
                             </w:r>
-                            <w:bookmarkEnd w:id="36"/>
-                            <w:bookmarkEnd w:id="37"/>
+                            <w:bookmarkEnd w:id="30"/>
+                            <w:bookmarkEnd w:id="31"/>
                           </w:p>
                         </w:txbxContent>
                       </wps:txbx>
@@ -9214,7 +8532,7 @@
           <w:noProof/>
         </w:rPr>
         <w:drawing>
-          <wp:anchor distT="0" distB="0" distL="114300" distR="114300" simplePos="0" relativeHeight="251668480" behindDoc="0" locked="0" layoutInCell="1" allowOverlap="1" wp14:anchorId="61CF8AAB" wp14:editId="16AD38F7">
+          <wp:anchor distT="0" distB="0" distL="114300" distR="114300" simplePos="0" relativeHeight="251668480" behindDoc="0" locked="0" layoutInCell="1" allowOverlap="1" wp14:anchorId="61CF8AAB" wp14:editId="5BD33766">
             <wp:simplePos x="0" y="0"/>
             <wp:positionH relativeFrom="margin">
               <wp:align>right</wp:align>
@@ -9348,29 +8666,19 @@
                                 <w:szCs w:val="24"/>
                               </w:rPr>
                             </w:pPr>
-                            <w:bookmarkStart w:id="40" w:name="_Toc226928230"/>
-                            <w:bookmarkStart w:id="41" w:name="_Toc226930440"/>
+                            <w:bookmarkStart w:id="32" w:name="_Toc226928230"/>
+                            <w:bookmarkStart w:id="33" w:name="_Toc226930440"/>
                             <w:r>
                               <w:t xml:space="preserve">Figure </w:t>
                             </w:r>
-                            <w:r>
-                              <w:fldChar w:fldCharType="begin"/>
-                            </w:r>
-                            <w:r>
-                              <w:instrText xml:space="preserve"> SEQ Figure \* ARABIC </w:instrText>
-                            </w:r>
-                            <w:r>
-                              <w:fldChar w:fldCharType="separate"/>
-                            </w:r>
-                            <w:r>
-                              <w:rPr>
-                                <w:noProof/>
-                              </w:rPr>
-                              <w:t>5</w:t>
-                            </w:r>
-                            <w:r>
-                              <w:fldChar w:fldCharType="end"/>
-                            </w:r>
+                            <w:fldSimple w:instr=" SEQ Figure \* ARABIC ">
+                              <w:r>
+                                <w:rPr>
+                                  <w:noProof/>
+                                </w:rPr>
+                                <w:t>5</w:t>
+                              </w:r>
+                            </w:fldSimple>
                             <w:r>
                               <w:rPr>
                                 <w:lang w:val="en-US"/>
@@ -9384,8 +8692,8 @@
                               </w:rPr>
                               <w:t>with linear input (same as in Figure 4).</w:t>
                             </w:r>
-                            <w:bookmarkEnd w:id="40"/>
-                            <w:bookmarkEnd w:id="41"/>
+                            <w:bookmarkEnd w:id="32"/>
+                            <w:bookmarkEnd w:id="33"/>
                           </w:p>
                         </w:txbxContent>
                       </wps:txbx>
@@ -9502,7 +8810,7 @@
           <w:noProof/>
         </w:rPr>
         <w:drawing>
-          <wp:anchor distT="0" distB="0" distL="114300" distR="114300" simplePos="0" relativeHeight="251667456" behindDoc="0" locked="0" layoutInCell="1" allowOverlap="1" wp14:anchorId="6F6187DF" wp14:editId="05382B28">
+          <wp:anchor distT="0" distB="0" distL="114300" distR="114300" simplePos="0" relativeHeight="251667456" behindDoc="0" locked="0" layoutInCell="1" allowOverlap="1" wp14:anchorId="6F6187DF" wp14:editId="05319FFC">
             <wp:simplePos x="0" y="0"/>
             <wp:positionH relativeFrom="margin">
               <wp:align>right</wp:align>
@@ -9637,29 +8945,19 @@
                                 <w:lang w:val="en-US"/>
                               </w:rPr>
                             </w:pPr>
-                            <w:bookmarkStart w:id="44" w:name="_Toc226928231"/>
-                            <w:bookmarkStart w:id="45" w:name="_Toc226930441"/>
+                            <w:bookmarkStart w:id="34" w:name="_Toc226928231"/>
+                            <w:bookmarkStart w:id="35" w:name="_Toc226930441"/>
                             <w:r>
                               <w:t xml:space="preserve">Figure </w:t>
                             </w:r>
-                            <w:r>
-                              <w:fldChar w:fldCharType="begin"/>
-                            </w:r>
-                            <w:r>
-                              <w:instrText xml:space="preserve"> SEQ Figure \* ARABIC </w:instrText>
-                            </w:r>
-                            <w:r>
-                              <w:fldChar w:fldCharType="separate"/>
-                            </w:r>
-                            <w:r>
-                              <w:rPr>
-                                <w:noProof/>
-                              </w:rPr>
-                              <w:t>6</w:t>
-                            </w:r>
-                            <w:r>
-                              <w:fldChar w:fldCharType="end"/>
-                            </w:r>
+                            <w:fldSimple w:instr=" SEQ Figure \* ARABIC ">
+                              <w:r>
+                                <w:rPr>
+                                  <w:noProof/>
+                                </w:rPr>
+                                <w:t>6</w:t>
+                              </w:r>
+                            </w:fldSimple>
                             <w:r>
                               <w:t xml:space="preserve">: The </w:t>
                             </w:r>
@@ -9687,8 +8985,8 @@
                               </w:rPr>
                               <w:t>.</w:t>
                             </w:r>
-                            <w:bookmarkEnd w:id="44"/>
-                            <w:bookmarkEnd w:id="45"/>
+                            <w:bookmarkEnd w:id="34"/>
+                            <w:bookmarkEnd w:id="35"/>
                           </w:p>
                         </w:txbxContent>
                       </wps:txbx>
@@ -10081,37 +9379,27 @@
                                 <w:szCs w:val="24"/>
                               </w:rPr>
                             </w:pPr>
-                            <w:bookmarkStart w:id="48" w:name="_Toc226928232"/>
-                            <w:bookmarkStart w:id="49" w:name="_Toc226930442"/>
+                            <w:bookmarkStart w:id="36" w:name="_Toc226928232"/>
+                            <w:bookmarkStart w:id="37" w:name="_Toc226930442"/>
                             <w:r>
                               <w:t xml:space="preserve">Figure </w:t>
                             </w:r>
-                            <w:r>
-                              <w:fldChar w:fldCharType="begin"/>
-                            </w:r>
-                            <w:r>
-                              <w:instrText xml:space="preserve"> SEQ Figure \* ARABIC </w:instrText>
-                            </w:r>
-                            <w:r>
-                              <w:fldChar w:fldCharType="separate"/>
-                            </w:r>
-                            <w:r>
-                              <w:rPr>
-                                <w:noProof/>
-                              </w:rPr>
-                              <w:t>7</w:t>
-                            </w:r>
-                            <w:r>
-                              <w:fldChar w:fldCharType="end"/>
-                            </w:r>
+                            <w:fldSimple w:instr=" SEQ Figure \* ARABIC ">
+                              <w:r>
+                                <w:rPr>
+                                  <w:noProof/>
+                                </w:rPr>
+                                <w:t>7</w:t>
+                              </w:r>
+                            </w:fldSimple>
                             <w:r>
                               <w:rPr>
                                 <w:lang w:val="en-US"/>
                               </w:rPr>
                               <w:t>: VCA. Schematic Design.</w:t>
                             </w:r>
-                            <w:bookmarkEnd w:id="48"/>
-                            <w:bookmarkEnd w:id="49"/>
+                            <w:bookmarkEnd w:id="36"/>
+                            <w:bookmarkEnd w:id="37"/>
                           </w:p>
                         </w:txbxContent>
                       </wps:txbx>
@@ -10207,7 +9495,7 @@
           <w:noProof/>
         </w:rPr>
         <w:drawing>
-          <wp:anchor distT="0" distB="0" distL="114300" distR="114300" simplePos="0" relativeHeight="251662336" behindDoc="0" locked="0" layoutInCell="1" allowOverlap="1" wp14:anchorId="41C7121F" wp14:editId="7C34E99D">
+          <wp:anchor distT="0" distB="0" distL="114300" distR="114300" simplePos="0" relativeHeight="251662336" behindDoc="0" locked="0" layoutInCell="1" allowOverlap="1" wp14:anchorId="41C7121F" wp14:editId="50025988">
             <wp:simplePos x="0" y="0"/>
             <wp:positionH relativeFrom="margin">
               <wp:align>left</wp:align>
@@ -10337,29 +9625,19 @@
                                 <w:noProof/>
                               </w:rPr>
                             </w:pPr>
-                            <w:bookmarkStart w:id="52" w:name="_Toc226928233"/>
-                            <w:bookmarkStart w:id="53" w:name="_Toc226930443"/>
+                            <w:bookmarkStart w:id="38" w:name="_Toc226928233"/>
+                            <w:bookmarkStart w:id="39" w:name="_Toc226930443"/>
                             <w:r>
                               <w:t xml:space="preserve">Figure </w:t>
                             </w:r>
-                            <w:r>
-                              <w:fldChar w:fldCharType="begin"/>
-                            </w:r>
-                            <w:r>
-                              <w:instrText xml:space="preserve"> SEQ Figure \* ARABIC </w:instrText>
-                            </w:r>
-                            <w:r>
-                              <w:fldChar w:fldCharType="separate"/>
-                            </w:r>
-                            <w:r>
-                              <w:rPr>
-                                <w:noProof/>
-                              </w:rPr>
-                              <w:t>8</w:t>
-                            </w:r>
-                            <w:r>
-                              <w:fldChar w:fldCharType="end"/>
-                            </w:r>
+                            <w:fldSimple w:instr=" SEQ Figure \* ARABIC ">
+                              <w:r>
+                                <w:rPr>
+                                  <w:noProof/>
+                                </w:rPr>
+                                <w:t>8</w:t>
+                              </w:r>
+                            </w:fldSimple>
                             <w:r>
                               <w:rPr>
                                 <w:lang w:val="en-US"/>
@@ -10378,8 +9656,8 @@
                               </w:rPr>
                               <w:t>tion of the input signal (blue) to the output signal (red) by the VCA via setting CV to 2V DC.</w:t>
                             </w:r>
-                            <w:bookmarkEnd w:id="52"/>
-                            <w:bookmarkEnd w:id="53"/>
+                            <w:bookmarkEnd w:id="38"/>
+                            <w:bookmarkEnd w:id="39"/>
                           </w:p>
                         </w:txbxContent>
                       </wps:txbx>
@@ -10499,7 +9777,7 @@
           <w:rFonts w:eastAsia="Times New Roman" w:cs="Times New Roman"/>
           <w:sz w:val="28"/>
           <w:szCs w:val="28"/>
-          <w:lang w:val="en-US" w:eastAsia="en-150"/>
+          <w:lang w:val="en-US"/>
         </w:rPr>
       </w:pPr>
       <w:r>
@@ -10592,7 +9870,7 @@
           <w:rFonts w:eastAsia="Times New Roman" w:cs="Times New Roman"/>
           <w:sz w:val="28"/>
           <w:szCs w:val="28"/>
-          <w:lang w:val="en-US" w:eastAsia="en-150"/>
+          <w:lang w:val="en-US"/>
         </w:rPr>
       </w:pPr>
       <w:r>
@@ -10643,37 +9921,27 @@
                                 <w:noProof/>
                               </w:rPr>
                             </w:pPr>
-                            <w:bookmarkStart w:id="56" w:name="_Toc226928235"/>
-                            <w:bookmarkStart w:id="57" w:name="_Toc226930444"/>
+                            <w:bookmarkStart w:id="40" w:name="_Toc226928235"/>
+                            <w:bookmarkStart w:id="41" w:name="_Toc226930444"/>
                             <w:r>
                               <w:t xml:space="preserve">Figure </w:t>
                             </w:r>
-                            <w:r>
-                              <w:fldChar w:fldCharType="begin"/>
-                            </w:r>
-                            <w:r>
-                              <w:instrText xml:space="preserve"> SEQ Figure \* ARABIC </w:instrText>
-                            </w:r>
-                            <w:r>
-                              <w:fldChar w:fldCharType="separate"/>
-                            </w:r>
-                            <w:r>
-                              <w:rPr>
-                                <w:noProof/>
-                              </w:rPr>
-                              <w:t>10</w:t>
-                            </w:r>
-                            <w:r>
-                              <w:fldChar w:fldCharType="end"/>
-                            </w:r>
+                            <w:fldSimple w:instr=" SEQ Figure \* ARABIC ">
+                              <w:r>
+                                <w:rPr>
+                                  <w:noProof/>
+                                </w:rPr>
+                                <w:t>10</w:t>
+                              </w:r>
+                            </w:fldSimple>
                             <w:r>
                               <w:rPr>
                                 <w:lang w:val="en-US"/>
                               </w:rPr>
                               <w:t>: A possible combination of input signals for the mixer.</w:t>
                             </w:r>
-                            <w:bookmarkEnd w:id="56"/>
-                            <w:bookmarkEnd w:id="57"/>
+                            <w:bookmarkEnd w:id="40"/>
+                            <w:bookmarkEnd w:id="41"/>
                           </w:p>
                         </w:txbxContent>
                       </wps:txbx>
@@ -10752,7 +10020,7 @@
           <w:noProof/>
         </w:rPr>
         <w:drawing>
-          <wp:anchor distT="0" distB="0" distL="114300" distR="114300" simplePos="0" relativeHeight="251663360" behindDoc="0" locked="0" layoutInCell="1" allowOverlap="1" wp14:anchorId="25000B75" wp14:editId="23AFE8AA">
+          <wp:anchor distT="0" distB="0" distL="114300" distR="114300" simplePos="0" relativeHeight="251663360" behindDoc="0" locked="0" layoutInCell="1" allowOverlap="1" wp14:anchorId="25000B75" wp14:editId="0D033B30">
             <wp:simplePos x="0" y="0"/>
             <wp:positionH relativeFrom="margin">
               <wp:align>right</wp:align>
@@ -10858,37 +10126,27 @@
                                 <w:szCs w:val="24"/>
                               </w:rPr>
                             </w:pPr>
-                            <w:bookmarkStart w:id="60" w:name="_Toc226928234"/>
-                            <w:bookmarkStart w:id="61" w:name="_Toc226930445"/>
+                            <w:bookmarkStart w:id="42" w:name="_Toc226928234"/>
+                            <w:bookmarkStart w:id="43" w:name="_Toc226930445"/>
                             <w:r>
                               <w:t xml:space="preserve">Figure </w:t>
                             </w:r>
-                            <w:r>
-                              <w:fldChar w:fldCharType="begin"/>
-                            </w:r>
-                            <w:r>
-                              <w:instrText xml:space="preserve"> SEQ Figure \* ARABIC </w:instrText>
-                            </w:r>
-                            <w:r>
-                              <w:fldChar w:fldCharType="separate"/>
-                            </w:r>
-                            <w:r>
-                              <w:rPr>
-                                <w:noProof/>
-                              </w:rPr>
-                              <w:t>9</w:t>
-                            </w:r>
-                            <w:r>
-                              <w:fldChar w:fldCharType="end"/>
-                            </w:r>
+                            <w:fldSimple w:instr=" SEQ Figure \* ARABIC ">
+                              <w:r>
+                                <w:rPr>
+                                  <w:noProof/>
+                                </w:rPr>
+                                <w:t>9</w:t>
+                              </w:r>
+                            </w:fldSimple>
                             <w:r>
                               <w:rPr>
                                 <w:lang w:val="en-US"/>
                               </w:rPr>
                               <w:t>: Mixer. Schematic Design.</w:t>
                             </w:r>
-                            <w:bookmarkEnd w:id="60"/>
-                            <w:bookmarkEnd w:id="61"/>
+                            <w:bookmarkEnd w:id="42"/>
+                            <w:bookmarkEnd w:id="43"/>
                           </w:p>
                         </w:txbxContent>
                       </wps:txbx>
@@ -11013,29 +10271,19 @@
                                 <w:noProof/>
                               </w:rPr>
                             </w:pPr>
-                            <w:bookmarkStart w:id="64" w:name="_Toc226928236"/>
-                            <w:bookmarkStart w:id="65" w:name="_Toc226930446"/>
+                            <w:bookmarkStart w:id="44" w:name="_Toc226928236"/>
+                            <w:bookmarkStart w:id="45" w:name="_Toc226930446"/>
                             <w:r>
                               <w:t xml:space="preserve">Figure </w:t>
                             </w:r>
-                            <w:r>
-                              <w:fldChar w:fldCharType="begin"/>
-                            </w:r>
-                            <w:r>
-                              <w:instrText xml:space="preserve"> SEQ Figure \* ARABIC </w:instrText>
-                            </w:r>
-                            <w:r>
-                              <w:fldChar w:fldCharType="separate"/>
-                            </w:r>
-                            <w:r>
-                              <w:rPr>
-                                <w:noProof/>
-                              </w:rPr>
-                              <w:t>11</w:t>
-                            </w:r>
-                            <w:r>
-                              <w:fldChar w:fldCharType="end"/>
-                            </w:r>
+                            <w:fldSimple w:instr=" SEQ Figure \* ARABIC ">
+                              <w:r>
+                                <w:rPr>
+                                  <w:noProof/>
+                                </w:rPr>
+                                <w:t>11</w:t>
+                              </w:r>
+                            </w:fldSimple>
                             <w:r>
                               <w:rPr>
                                 <w:lang w:val="en-US"/>
@@ -11055,8 +10303,8 @@
                               </w:rPr>
                               <w:t>- of the Mixer for the input signals from Figure 10.</w:t>
                             </w:r>
-                            <w:bookmarkEnd w:id="64"/>
-                            <w:bookmarkEnd w:id="65"/>
+                            <w:bookmarkEnd w:id="44"/>
+                            <w:bookmarkEnd w:id="45"/>
                           </w:p>
                         </w:txbxContent>
                       </wps:txbx>
@@ -11148,7 +10396,7 @@
           <w:noProof/>
         </w:rPr>
         <w:drawing>
-          <wp:anchor distT="0" distB="0" distL="114300" distR="114300" simplePos="0" relativeHeight="251664384" behindDoc="0" locked="0" layoutInCell="1" allowOverlap="1" wp14:anchorId="0E46B37A" wp14:editId="2EE68134">
+          <wp:anchor distT="0" distB="0" distL="114300" distR="114300" simplePos="0" relativeHeight="251664384" behindDoc="0" locked="0" layoutInCell="1" allowOverlap="1" wp14:anchorId="0E46B37A" wp14:editId="1F514CFD">
             <wp:simplePos x="0" y="0"/>
             <wp:positionH relativeFrom="margin">
               <wp:align>left</wp:align>
@@ -11217,7 +10465,7 @@
 </file>
 
 <file path=word/comments.xml><?xml version="1.0" encoding="utf-8"?>
-<w:comments xmlns:wpc="http://schemas.microsoft.com/office/word/2010/wordprocessingCanvas" xmlns:cx="http://schemas.microsoft.com/office/drawing/2014/chartex" xmlns:cx1="http://schemas.microsoft.com/office/drawing/2015/9/8/chartex" xmlns:cx2="http://schemas.microsoft.com/office/drawing/2015/10/21/chartex" xmlns:cx3="http://schemas.microsoft.com/office/drawing/2016/5/9/chartex" xmlns:cx4="http://schemas.microsoft.com/office/drawing/2016/5/10/chartex" xmlns:cx5="http://schemas.microsoft.com/office/drawing/2016/5/11/chartex" xmlns:cx6="http://schemas.microsoft.com/office/drawing/2016/5/12/chartex" xmlns:cx7="http://schemas.microsoft.com/office/drawing/2016/5/13/chartex" xmlns:cx8="http://schemas.microsoft.com/office/drawing/2016/5/14/chartex" xmlns:mc="http://schemas.openxmlformats.org/markup-compatibility/2006" xmlns:aink="http://schemas.microsoft.com/office/drawing/2016/ink" xmlns:am3d="http://schemas.microsoft.com/office/drawing/2017/model3d" xmlns:o="urn:schemas-microsoft-com:office:office" xmlns:r="http://schemas.openxmlformats.org/officeDocument/2006/relationships" xmlns:m="http://schemas.openxmlformats.org/officeDocument/2006/math" xmlns:v="urn:schemas-microsoft-com:vml" xmlns:wp14="http://schemas.microsoft.com/office/word/2010/wordprocessingDrawing" xmlns:wp="http://schemas.openxmlformats.org/drawingml/2006/wordprocessingDrawing" xmlns:w10="urn:schemas-microsoft-com:office:word" xmlns:w="http://schemas.openxmlformats.org/wordprocessingml/2006/main" xmlns:w14="http://schemas.microsoft.com/office/word/2010/wordml" xmlns:w15="http://schemas.microsoft.com/office/word/2012/wordml" xmlns:w16cex="http://schemas.microsoft.com/office/word/2018/wordml/cex" xmlns:w16cid="http://schemas.microsoft.com/office/word/2016/wordml/cid" xmlns:w16="http://schemas.microsoft.com/office/word/2018/wordml" xmlns:w16sdtdh="http://schemas.microsoft.com/office/word/2020/wordml/sdtdatahash" xmlns:w16se="http://schemas.microsoft.com/office/word/2015/wordml/symex" xmlns:wpg="http://schemas.microsoft.com/office/word/2010/wordprocessingGroup" xmlns:wpi="http://schemas.microsoft.com/office/word/2010/wordprocessingInk" xmlns:wne="http://schemas.microsoft.com/office/word/2006/wordml" xmlns:wps="http://schemas.microsoft.com/office/word/2010/wordprocessingShape" mc:Ignorable="w14 w15 w16se w16cid w16 w16cex w16sdtdh wp14">
+<w:comments xmlns:wpc="http://schemas.microsoft.com/office/word/2010/wordprocessingCanvas" xmlns:cx="http://schemas.microsoft.com/office/drawing/2014/chartex" xmlns:cx1="http://schemas.microsoft.com/office/drawing/2015/9/8/chartex" xmlns:cx2="http://schemas.microsoft.com/office/drawing/2015/10/21/chartex" xmlns:cx3="http://schemas.microsoft.com/office/drawing/2016/5/9/chartex" xmlns:cx4="http://schemas.microsoft.com/office/drawing/2016/5/10/chartex" xmlns:cx5="http://schemas.microsoft.com/office/drawing/2016/5/11/chartex" xmlns:cx6="http://schemas.microsoft.com/office/drawing/2016/5/12/chartex" xmlns:cx7="http://schemas.microsoft.com/office/drawing/2016/5/13/chartex" xmlns:cx8="http://schemas.microsoft.com/office/drawing/2016/5/14/chartex" xmlns:mc="http://schemas.openxmlformats.org/markup-compatibility/2006" xmlns:aink="http://schemas.microsoft.com/office/drawing/2016/ink" xmlns:am3d="http://schemas.microsoft.com/office/drawing/2017/model3d" xmlns:o="urn:schemas-microsoft-com:office:office" xmlns:oel="http://schemas.microsoft.com/office/2019/extlst" xmlns:r="http://schemas.openxmlformats.org/officeDocument/2006/relationships" xmlns:m="http://schemas.openxmlformats.org/officeDocument/2006/math" xmlns:v="urn:schemas-microsoft-com:vml" xmlns:wp14="http://schemas.microsoft.com/office/word/2010/wordprocessingDrawing" xmlns:wp="http://schemas.openxmlformats.org/drawingml/2006/wordprocessingDrawing" xmlns:w10="urn:schemas-microsoft-com:office:word" xmlns:w="http://schemas.openxmlformats.org/wordprocessingml/2006/main" xmlns:w14="http://schemas.microsoft.com/office/word/2010/wordml" xmlns:w15="http://schemas.microsoft.com/office/word/2012/wordml" xmlns:w16cex="http://schemas.microsoft.com/office/word/2018/wordml/cex" xmlns:w16cid="http://schemas.microsoft.com/office/word/2016/wordml/cid" xmlns:w16="http://schemas.microsoft.com/office/word/2018/wordml" xmlns:w16du="http://schemas.microsoft.com/office/word/2023/wordml/word16du" xmlns:w16sdtdh="http://schemas.microsoft.com/office/word/2020/wordml/sdtdatahash" xmlns:w16sdtfl="http://schemas.microsoft.com/office/word/2024/wordml/sdtformatlock" xmlns:w16se="http://schemas.microsoft.com/office/word/2015/wordml/symex" xmlns:wpg="http://schemas.microsoft.com/office/word/2010/wordprocessingGroup" xmlns:wpi="http://schemas.microsoft.com/office/word/2010/wordprocessingInk" xmlns:wne="http://schemas.microsoft.com/office/word/2006/wordml" xmlns:wps="http://schemas.microsoft.com/office/word/2010/wordprocessingShape" mc:Ignorable="w14 w15 w16se w16cid w16 w16cex w16sdtdh w16sdtfl w16du wp14">
   <w:comment w:id="6" w:author="Nikoloz Bezhanishvili" w:date="2026-04-09T23:50:00Z" w:initials="NB">
     <w:p>
       <w:pPr>
@@ -11348,10 +10596,7 @@
         <w:pStyle w:val="NormalWeb"/>
       </w:pPr>
       <w:r>
-        <w:t xml:space="preserve">This is the clever part of the circuit. It takes the </w:t>
-      </w:r>
-      <w:r>
-        <w:t>Square wave from the Schmitt Trigger and uses it to reverse the direction of the Integrator, keeping the cycle going forever.</w:t>
+        <w:t>This is the clever part of the circuit. It takes the Square wave from the Schmitt Trigger and uses it to reverse the direction of the Integrator, keeping the cycle going forever.</w:t>
       </w:r>
     </w:p>
     <w:p>
@@ -11556,7 +10801,7 @@
 </file>
 
 <file path=word/commentsExtended.xml><?xml version="1.0" encoding="utf-8"?>
-<w15:commentsEx xmlns:wpc="http://schemas.microsoft.com/office/word/2010/wordprocessingCanvas" xmlns:cx="http://schemas.microsoft.com/office/drawing/2014/chartex" xmlns:cx1="http://schemas.microsoft.com/office/drawing/2015/9/8/chartex" xmlns:cx2="http://schemas.microsoft.com/office/drawing/2015/10/21/chartex" xmlns:cx3="http://schemas.microsoft.com/office/drawing/2016/5/9/chartex" xmlns:cx4="http://schemas.microsoft.com/office/drawing/2016/5/10/chartex" xmlns:cx5="http://schemas.microsoft.com/office/drawing/2016/5/11/chartex" xmlns:cx6="http://schemas.microsoft.com/office/drawing/2016/5/12/chartex" xmlns:cx7="http://schemas.microsoft.com/office/drawing/2016/5/13/chartex" xmlns:cx8="http://schemas.microsoft.com/office/drawing/2016/5/14/chartex" xmlns:mc="http://schemas.openxmlformats.org/markup-compatibility/2006" xmlns:aink="http://schemas.microsoft.com/office/drawing/2016/ink" xmlns:am3d="http://schemas.microsoft.com/office/drawing/2017/model3d" xmlns:o="urn:schemas-microsoft-com:office:office" xmlns:r="http://schemas.openxmlformats.org/officeDocument/2006/relationships" xmlns:m="http://schemas.openxmlformats.org/officeDocument/2006/math" xmlns:v="urn:schemas-microsoft-com:vml" xmlns:wp14="http://schemas.microsoft.com/office/word/2010/wordprocessingDrawing" xmlns:wp="http://schemas.openxmlformats.org/drawingml/2006/wordprocessingDrawing" xmlns:w10="urn:schemas-microsoft-com:office:word" xmlns:w="http://schemas.openxmlformats.org/wordprocessingml/2006/main" xmlns:w14="http://schemas.microsoft.com/office/word/2010/wordml" xmlns:w15="http://schemas.microsoft.com/office/word/2012/wordml" xmlns:w16cex="http://schemas.microsoft.com/office/word/2018/wordml/cex" xmlns:w16cid="http://schemas.microsoft.com/office/word/2016/wordml/cid" xmlns:w16="http://schemas.microsoft.com/office/word/2018/wordml" xmlns:w16sdtdh="http://schemas.microsoft.com/office/word/2020/wordml/sdtdatahash" xmlns:w16se="http://schemas.microsoft.com/office/word/2015/wordml/symex" xmlns:wpg="http://schemas.microsoft.com/office/word/2010/wordprocessingGroup" xmlns:wpi="http://schemas.microsoft.com/office/word/2010/wordprocessingInk" xmlns:wne="http://schemas.microsoft.com/office/word/2006/wordml" xmlns:wps="http://schemas.microsoft.com/office/word/2010/wordprocessingShape" mc:Ignorable="w14 w15 w16se w16cid w16 w16cex w16sdtdh wp14">
+<w15:commentsEx xmlns:wpc="http://schemas.microsoft.com/office/word/2010/wordprocessingCanvas" xmlns:cx="http://schemas.microsoft.com/office/drawing/2014/chartex" xmlns:cx1="http://schemas.microsoft.com/office/drawing/2015/9/8/chartex" xmlns:cx2="http://schemas.microsoft.com/office/drawing/2015/10/21/chartex" xmlns:cx3="http://schemas.microsoft.com/office/drawing/2016/5/9/chartex" xmlns:cx4="http://schemas.microsoft.com/office/drawing/2016/5/10/chartex" xmlns:cx5="http://schemas.microsoft.com/office/drawing/2016/5/11/chartex" xmlns:cx6="http://schemas.microsoft.com/office/drawing/2016/5/12/chartex" xmlns:cx7="http://schemas.microsoft.com/office/drawing/2016/5/13/chartex" xmlns:cx8="http://schemas.microsoft.com/office/drawing/2016/5/14/chartex" xmlns:mc="http://schemas.openxmlformats.org/markup-compatibility/2006" xmlns:aink="http://schemas.microsoft.com/office/drawing/2016/ink" xmlns:am3d="http://schemas.microsoft.com/office/drawing/2017/model3d" xmlns:o="urn:schemas-microsoft-com:office:office" xmlns:oel="http://schemas.microsoft.com/office/2019/extlst" xmlns:r="http://schemas.openxmlformats.org/officeDocument/2006/relationships" xmlns:m="http://schemas.openxmlformats.org/officeDocument/2006/math" xmlns:v="urn:schemas-microsoft-com:vml" xmlns:wp14="http://schemas.microsoft.com/office/word/2010/wordprocessingDrawing" xmlns:wp="http://schemas.openxmlformats.org/drawingml/2006/wordprocessingDrawing" xmlns:w10="urn:schemas-microsoft-com:office:word" xmlns:w="http://schemas.openxmlformats.org/wordprocessingml/2006/main" xmlns:w14="http://schemas.microsoft.com/office/word/2010/wordml" xmlns:w15="http://schemas.microsoft.com/office/word/2012/wordml" xmlns:w16cex="http://schemas.microsoft.com/office/word/2018/wordml/cex" xmlns:w16cid="http://schemas.microsoft.com/office/word/2016/wordml/cid" xmlns:w16="http://schemas.microsoft.com/office/word/2018/wordml" xmlns:w16du="http://schemas.microsoft.com/office/word/2023/wordml/word16du" xmlns:w16sdtdh="http://schemas.microsoft.com/office/word/2020/wordml/sdtdatahash" xmlns:w16sdtfl="http://schemas.microsoft.com/office/word/2024/wordml/sdtformatlock" xmlns:w16se="http://schemas.microsoft.com/office/word/2015/wordml/symex" xmlns:wpg="http://schemas.microsoft.com/office/word/2010/wordprocessingGroup" xmlns:wpi="http://schemas.microsoft.com/office/word/2010/wordprocessingInk" xmlns:wne="http://schemas.microsoft.com/office/word/2006/wordml" xmlns:wps="http://schemas.microsoft.com/office/word/2010/wordprocessingShape" mc:Ignorable="w14 w15 w16se w16cid w16 w16cex w16sdtdh w16sdtfl w16du wp14">
   <w15:commentEx w15:paraId="03A65AD1" w15:done="0"/>
   <w15:commentEx w15:paraId="1C85D51B" w15:done="0"/>
   <w15:commentEx w15:paraId="5D20ACE9" w15:done="0"/>
@@ -11569,7 +10814,7 @@
 </file>
 
 <file path=word/commentsExtensible.xml><?xml version="1.0" encoding="utf-8"?>
-<w16cex:commentsExtensible xmlns:wpc="http://schemas.microsoft.com/office/word/2010/wordprocessingCanvas" xmlns:cx="http://schemas.microsoft.com/office/drawing/2014/chartex" xmlns:cx1="http://schemas.microsoft.com/office/drawing/2015/9/8/chartex" xmlns:cx2="http://schemas.microsoft.com/office/drawing/2015/10/21/chartex" xmlns:cx3="http://schemas.microsoft.com/office/drawing/2016/5/9/chartex" xmlns:cx4="http://schemas.microsoft.com/office/drawing/2016/5/10/chartex" xmlns:cx5="http://schemas.microsoft.com/office/drawing/2016/5/11/chartex" xmlns:cx6="http://schemas.microsoft.com/office/drawing/2016/5/12/chartex" xmlns:cx7="http://schemas.microsoft.com/office/drawing/2016/5/13/chartex" xmlns:cx8="http://schemas.microsoft.com/office/drawing/2016/5/14/chartex" xmlns:mc="http://schemas.openxmlformats.org/markup-compatibility/2006" xmlns:aink="http://schemas.microsoft.com/office/drawing/2016/ink" xmlns:am3d="http://schemas.microsoft.com/office/drawing/2017/model3d" xmlns:o="urn:schemas-microsoft-com:office:office" xmlns:r="http://schemas.openxmlformats.org/officeDocument/2006/relationships" xmlns:m="http://schemas.openxmlformats.org/officeDocument/2006/math" xmlns:v="urn:schemas-microsoft-com:vml" xmlns:wp14="http://schemas.microsoft.com/office/word/2010/wordprocessingDrawing" xmlns:wp="http://schemas.openxmlformats.org/drawingml/2006/wordprocessingDrawing" xmlns:w10="urn:schemas-microsoft-com:office:word" xmlns:w="http://schemas.openxmlformats.org/wordprocessingml/2006/main" xmlns:w14="http://schemas.microsoft.com/office/word/2010/wordml" xmlns:w15="http://schemas.microsoft.com/office/word/2012/wordml" xmlns:w16cex="http://schemas.microsoft.com/office/word/2018/wordml/cex" xmlns:w16cid="http://schemas.microsoft.com/office/word/2016/wordml/cid" xmlns:w16="http://schemas.microsoft.com/office/word/2018/wordml" xmlns:w16sdtdh="http://schemas.microsoft.com/office/word/2020/wordml/sdtdatahash" xmlns:w16se="http://schemas.microsoft.com/office/word/2015/wordml/symex" xmlns:wpg="http://schemas.microsoft.com/office/word/2010/wordprocessingGroup" xmlns:wpi="http://schemas.microsoft.com/office/word/2010/wordprocessingInk" xmlns:wne="http://schemas.microsoft.com/office/word/2006/wordml" xmlns:wps="http://schemas.microsoft.com/office/word/2010/wordprocessingShape" mc:Ignorable="w14 w15 w16se w16cid w16 w16cex w16sdtdh wp14">
+<w16cex:commentsExtensible xmlns:wpc="http://schemas.microsoft.com/office/word/2010/wordprocessingCanvas" xmlns:cx="http://schemas.microsoft.com/office/drawing/2014/chartex" xmlns:cx1="http://schemas.microsoft.com/office/drawing/2015/9/8/chartex" xmlns:cx2="http://schemas.microsoft.com/office/drawing/2015/10/21/chartex" xmlns:cx3="http://schemas.microsoft.com/office/drawing/2016/5/9/chartex" xmlns:cx4="http://schemas.microsoft.com/office/drawing/2016/5/10/chartex" xmlns:cx5="http://schemas.microsoft.com/office/drawing/2016/5/11/chartex" xmlns:cx6="http://schemas.microsoft.com/office/drawing/2016/5/12/chartex" xmlns:cx7="http://schemas.microsoft.com/office/drawing/2016/5/13/chartex" xmlns:cx8="http://schemas.microsoft.com/office/drawing/2016/5/14/chartex" xmlns:cr="http://schemas.microsoft.com/office/comments/2020/reactions" xmlns:mc="http://schemas.openxmlformats.org/markup-compatibility/2006" xmlns:aink="http://schemas.microsoft.com/office/drawing/2016/ink" xmlns:am3d="http://schemas.microsoft.com/office/drawing/2017/model3d" xmlns:o="urn:schemas-microsoft-com:office:office" xmlns:oel="http://schemas.microsoft.com/office/2019/extlst" xmlns:r="http://schemas.openxmlformats.org/officeDocument/2006/relationships" xmlns:m="http://schemas.openxmlformats.org/officeDocument/2006/math" xmlns:v="urn:schemas-microsoft-com:vml" xmlns:wp14="http://schemas.microsoft.com/office/word/2010/wordprocessingDrawing" xmlns:wp="http://schemas.openxmlformats.org/drawingml/2006/wordprocessingDrawing" xmlns:w10="urn:schemas-microsoft-com:office:word" xmlns:w="http://schemas.openxmlformats.org/wordprocessingml/2006/main" xmlns:w14="http://schemas.microsoft.com/office/word/2010/wordml" xmlns:w15="http://schemas.microsoft.com/office/word/2012/wordml" xmlns:w16cex="http://schemas.microsoft.com/office/word/2018/wordml/cex" xmlns:w16cid="http://schemas.microsoft.com/office/word/2016/wordml/cid" xmlns:w16="http://schemas.microsoft.com/office/word/2018/wordml" xmlns:w16du="http://schemas.microsoft.com/office/word/2023/wordml/word16du" xmlns:w16sdtdh="http://schemas.microsoft.com/office/word/2020/wordml/sdtdatahash" xmlns:w16sdtfl="http://schemas.microsoft.com/office/word/2024/wordml/sdtformatlock" xmlns:w16se="http://schemas.microsoft.com/office/word/2015/wordml/symex" xmlns:wpg="http://schemas.microsoft.com/office/word/2010/wordprocessingGroup" xmlns:wpi="http://schemas.microsoft.com/office/word/2010/wordprocessingInk" xmlns:wne="http://schemas.microsoft.com/office/word/2006/wordml" xmlns:wps="http://schemas.microsoft.com/office/word/2010/wordprocessingShape" mc:Ignorable="w14 w15 w16se w16cid w16 w16cex w16sdtdh w16sdtfl cr w16du wp14">
   <w16cex:commentExtensible w16cex:durableId="2D82B9D0" w16cex:dateUtc="2026-04-09T19:50:00Z"/>
   <w16cex:commentExtensible w16cex:durableId="2D82C446" w16cex:dateUtc="2026-04-09T20:35:00Z"/>
   <w16cex:commentExtensible w16cex:durableId="2D83CD96" w16cex:dateUtc="2026-04-10T15:27:00Z"/>
@@ -11582,7 +10827,7 @@
 </file>
 
 <file path=word/commentsIds.xml><?xml version="1.0" encoding="utf-8"?>
-<w16cid:commentsIds xmlns:wpc="http://schemas.microsoft.com/office/word/2010/wordprocessingCanvas" xmlns:cx="http://schemas.microsoft.com/office/drawing/2014/chartex" xmlns:cx1="http://schemas.microsoft.com/office/drawing/2015/9/8/chartex" xmlns:cx2="http://schemas.microsoft.com/office/drawing/2015/10/21/chartex" xmlns:cx3="http://schemas.microsoft.com/office/drawing/2016/5/9/chartex" xmlns:cx4="http://schemas.microsoft.com/office/drawing/2016/5/10/chartex" xmlns:cx5="http://schemas.microsoft.com/office/drawing/2016/5/11/chartex" xmlns:cx6="http://schemas.microsoft.com/office/drawing/2016/5/12/chartex" xmlns:cx7="http://schemas.microsoft.com/office/drawing/2016/5/13/chartex" xmlns:cx8="http://schemas.microsoft.com/office/drawing/2016/5/14/chartex" xmlns:mc="http://schemas.openxmlformats.org/markup-compatibility/2006" xmlns:aink="http://schemas.microsoft.com/office/drawing/2016/ink" xmlns:am3d="http://schemas.microsoft.com/office/drawing/2017/model3d" xmlns:o="urn:schemas-microsoft-com:office:office" xmlns:r="http://schemas.openxmlformats.org/officeDocument/2006/relationships" xmlns:m="http://schemas.openxmlformats.org/officeDocument/2006/math" xmlns:v="urn:schemas-microsoft-com:vml" xmlns:wp14="http://schemas.microsoft.com/office/word/2010/wordprocessingDrawing" xmlns:wp="http://schemas.openxmlformats.org/drawingml/2006/wordprocessingDrawing" xmlns:w10="urn:schemas-microsoft-com:office:word" xmlns:w="http://schemas.openxmlformats.org/wordprocessingml/2006/main" xmlns:w14="http://schemas.microsoft.com/office/word/2010/wordml" xmlns:w15="http://schemas.microsoft.com/office/word/2012/wordml" xmlns:w16cex="http://schemas.microsoft.com/office/word/2018/wordml/cex" xmlns:w16cid="http://schemas.microsoft.com/office/word/2016/wordml/cid" xmlns:w16="http://schemas.microsoft.com/office/word/2018/wordml" xmlns:w16sdtdh="http://schemas.microsoft.com/office/word/2020/wordml/sdtdatahash" xmlns:w16se="http://schemas.microsoft.com/office/word/2015/wordml/symex" xmlns:wpg="http://schemas.microsoft.com/office/word/2010/wordprocessingGroup" xmlns:wpi="http://schemas.microsoft.com/office/word/2010/wordprocessingInk" xmlns:wne="http://schemas.microsoft.com/office/word/2006/wordml" xmlns:wps="http://schemas.microsoft.com/office/word/2010/wordprocessingShape" mc:Ignorable="w14 w15 w16se w16cid w16 w16cex w16sdtdh wp14">
+<w16cid:commentsIds xmlns:wpc="http://schemas.microsoft.com/office/word/2010/wordprocessingCanvas" xmlns:cx="http://schemas.microsoft.com/office/drawing/2014/chartex" xmlns:cx1="http://schemas.microsoft.com/office/drawing/2015/9/8/chartex" xmlns:cx2="http://schemas.microsoft.com/office/drawing/2015/10/21/chartex" xmlns:cx3="http://schemas.microsoft.com/office/drawing/2016/5/9/chartex" xmlns:cx4="http://schemas.microsoft.com/office/drawing/2016/5/10/chartex" xmlns:cx5="http://schemas.microsoft.com/office/drawing/2016/5/11/chartex" xmlns:cx6="http://schemas.microsoft.com/office/drawing/2016/5/12/chartex" xmlns:cx7="http://schemas.microsoft.com/office/drawing/2016/5/13/chartex" xmlns:cx8="http://schemas.microsoft.com/office/drawing/2016/5/14/chartex" xmlns:mc="http://schemas.openxmlformats.org/markup-compatibility/2006" xmlns:aink="http://schemas.microsoft.com/office/drawing/2016/ink" xmlns:am3d="http://schemas.microsoft.com/office/drawing/2017/model3d" xmlns:o="urn:schemas-microsoft-com:office:office" xmlns:oel="http://schemas.microsoft.com/office/2019/extlst" xmlns:r="http://schemas.openxmlformats.org/officeDocument/2006/relationships" xmlns:m="http://schemas.openxmlformats.org/officeDocument/2006/math" xmlns:v="urn:schemas-microsoft-com:vml" xmlns:wp14="http://schemas.microsoft.com/office/word/2010/wordprocessingDrawing" xmlns:wp="http://schemas.openxmlformats.org/drawingml/2006/wordprocessingDrawing" xmlns:w10="urn:schemas-microsoft-com:office:word" xmlns:w="http://schemas.openxmlformats.org/wordprocessingml/2006/main" xmlns:w14="http://schemas.microsoft.com/office/word/2010/wordml" xmlns:w15="http://schemas.microsoft.com/office/word/2012/wordml" xmlns:w16cex="http://schemas.microsoft.com/office/word/2018/wordml/cex" xmlns:w16cid="http://schemas.microsoft.com/office/word/2016/wordml/cid" xmlns:w16="http://schemas.microsoft.com/office/word/2018/wordml" xmlns:w16du="http://schemas.microsoft.com/office/word/2023/wordml/word16du" xmlns:w16sdtdh="http://schemas.microsoft.com/office/word/2020/wordml/sdtdatahash" xmlns:w16sdtfl="http://schemas.microsoft.com/office/word/2024/wordml/sdtformatlock" xmlns:w16se="http://schemas.microsoft.com/office/word/2015/wordml/symex" xmlns:wpg="http://schemas.microsoft.com/office/word/2010/wordprocessingGroup" xmlns:wpi="http://schemas.microsoft.com/office/word/2010/wordprocessingInk" xmlns:wne="http://schemas.microsoft.com/office/word/2006/wordml" xmlns:wps="http://schemas.microsoft.com/office/word/2010/wordprocessingShape" mc:Ignorable="w14 w15 w16se w16cid w16 w16cex w16sdtdh w16sdtfl w16du wp14">
   <w16cid:commentId w16cid:paraId="03A65AD1" w16cid:durableId="2D82B9D0"/>
   <w16cid:commentId w16cid:paraId="1C85D51B" w16cid:durableId="2D82C446"/>
   <w16cid:commentId w16cid:paraId="5D20ACE9" w16cid:durableId="2D83CD96"/>
@@ -11595,7 +10840,7 @@
 </file>
 
 <file path=word/endnotes.xml><?xml version="1.0" encoding="utf-8"?>
-<w:endnotes xmlns:wpc="http://schemas.microsoft.com/office/word/2010/wordprocessingCanvas" xmlns:cx="http://schemas.microsoft.com/office/drawing/2014/chartex" xmlns:cx1="http://schemas.microsoft.com/office/drawing/2015/9/8/chartex" xmlns:cx2="http://schemas.microsoft.com/office/drawing/2015/10/21/chartex" xmlns:cx3="http://schemas.microsoft.com/office/drawing/2016/5/9/chartex" xmlns:cx4="http://schemas.microsoft.com/office/drawing/2016/5/10/chartex" xmlns:cx5="http://schemas.microsoft.com/office/drawing/2016/5/11/chartex" xmlns:cx6="http://schemas.microsoft.com/office/drawing/2016/5/12/chartex" xmlns:cx7="http://schemas.microsoft.com/office/drawing/2016/5/13/chartex" xmlns:cx8="http://schemas.microsoft.com/office/drawing/2016/5/14/chartex" xmlns:mc="http://schemas.openxmlformats.org/markup-compatibility/2006" xmlns:aink="http://schemas.microsoft.com/office/drawing/2016/ink" xmlns:am3d="http://schemas.microsoft.com/office/drawing/2017/model3d" xmlns:o="urn:schemas-microsoft-com:office:office" xmlns:r="http://schemas.openxmlformats.org/officeDocument/2006/relationships" xmlns:m="http://schemas.openxmlformats.org/officeDocument/2006/math" xmlns:v="urn:schemas-microsoft-com:vml" xmlns:wp14="http://schemas.microsoft.com/office/word/2010/wordprocessingDrawing" xmlns:wp="http://schemas.openxmlformats.org/drawingml/2006/wordprocessingDrawing" xmlns:w10="urn:schemas-microsoft-com:office:word" xmlns:w="http://schemas.openxmlformats.org/wordprocessingml/2006/main" xmlns:w14="http://schemas.microsoft.com/office/word/2010/wordml" xmlns:w15="http://schemas.microsoft.com/office/word/2012/wordml" xmlns:w16cex="http://schemas.microsoft.com/office/word/2018/wordml/cex" xmlns:w16cid="http://schemas.microsoft.com/office/word/2016/wordml/cid" xmlns:w16="http://schemas.microsoft.com/office/word/2018/wordml" xmlns:w16sdtdh="http://schemas.microsoft.com/office/word/2020/wordml/sdtdatahash" xmlns:w16se="http://schemas.microsoft.com/office/word/2015/wordml/symex" xmlns:wpg="http://schemas.microsoft.com/office/word/2010/wordprocessingGroup" xmlns:wpi="http://schemas.microsoft.com/office/word/2010/wordprocessingInk" xmlns:wne="http://schemas.microsoft.com/office/word/2006/wordml" xmlns:wps="http://schemas.microsoft.com/office/word/2010/wordprocessingShape" mc:Ignorable="w14 w15 w16se w16cid w16 w16cex w16sdtdh wp14">
+<w:endnotes xmlns:wpc="http://schemas.microsoft.com/office/word/2010/wordprocessingCanvas" xmlns:cx="http://schemas.microsoft.com/office/drawing/2014/chartex" xmlns:cx1="http://schemas.microsoft.com/office/drawing/2015/9/8/chartex" xmlns:cx2="http://schemas.microsoft.com/office/drawing/2015/10/21/chartex" xmlns:cx3="http://schemas.microsoft.com/office/drawing/2016/5/9/chartex" xmlns:cx4="http://schemas.microsoft.com/office/drawing/2016/5/10/chartex" xmlns:cx5="http://schemas.microsoft.com/office/drawing/2016/5/11/chartex" xmlns:cx6="http://schemas.microsoft.com/office/drawing/2016/5/12/chartex" xmlns:cx7="http://schemas.microsoft.com/office/drawing/2016/5/13/chartex" xmlns:cx8="http://schemas.microsoft.com/office/drawing/2016/5/14/chartex" xmlns:mc="http://schemas.openxmlformats.org/markup-compatibility/2006" xmlns:aink="http://schemas.microsoft.com/office/drawing/2016/ink" xmlns:am3d="http://schemas.microsoft.com/office/drawing/2017/model3d" xmlns:o="urn:schemas-microsoft-com:office:office" xmlns:oel="http://schemas.microsoft.com/office/2019/extlst" xmlns:r="http://schemas.openxmlformats.org/officeDocument/2006/relationships" xmlns:m="http://schemas.openxmlformats.org/officeDocument/2006/math" xmlns:v="urn:schemas-microsoft-com:vml" xmlns:wp14="http://schemas.microsoft.com/office/word/2010/wordprocessingDrawing" xmlns:wp="http://schemas.openxmlformats.org/drawingml/2006/wordprocessingDrawing" xmlns:w10="urn:schemas-microsoft-com:office:word" xmlns:w="http://schemas.openxmlformats.org/wordprocessingml/2006/main" xmlns:w14="http://schemas.microsoft.com/office/word/2010/wordml" xmlns:w15="http://schemas.microsoft.com/office/word/2012/wordml" xmlns:w16cex="http://schemas.microsoft.com/office/word/2018/wordml/cex" xmlns:w16cid="http://schemas.microsoft.com/office/word/2016/wordml/cid" xmlns:w16="http://schemas.microsoft.com/office/word/2018/wordml" xmlns:w16du="http://schemas.microsoft.com/office/word/2023/wordml/word16du" xmlns:w16sdtdh="http://schemas.microsoft.com/office/word/2020/wordml/sdtdatahash" xmlns:w16sdtfl="http://schemas.microsoft.com/office/word/2024/wordml/sdtformatlock" xmlns:w16se="http://schemas.microsoft.com/office/word/2015/wordml/symex" xmlns:wpg="http://schemas.microsoft.com/office/word/2010/wordprocessingGroup" xmlns:wpi="http://schemas.microsoft.com/office/word/2010/wordprocessingInk" xmlns:wne="http://schemas.microsoft.com/office/word/2006/wordml" xmlns:wps="http://schemas.microsoft.com/office/word/2010/wordprocessingShape" mc:Ignorable="w14 w15 w16se w16cid w16 w16cex w16sdtdh w16sdtfl w16du wp14">
   <w:endnote w:type="separator" w:id="-1">
     <w:p>
       <w:pPr>
@@ -11620,7 +10865,7 @@
 </file>
 
 <file path=word/footer1.xml><?xml version="1.0" encoding="utf-8"?>
-<w:ftr xmlns:wpc="http://schemas.microsoft.com/office/word/2010/wordprocessingCanvas" xmlns:cx="http://schemas.microsoft.com/office/drawing/2014/chartex" xmlns:cx1="http://schemas.microsoft.com/office/drawing/2015/9/8/chartex" xmlns:cx2="http://schemas.microsoft.com/office/drawing/2015/10/21/chartex" xmlns:cx3="http://schemas.microsoft.com/office/drawing/2016/5/9/chartex" xmlns:cx4="http://schemas.microsoft.com/office/drawing/2016/5/10/chartex" xmlns:cx5="http://schemas.microsoft.com/office/drawing/2016/5/11/chartex" xmlns:cx6="http://schemas.microsoft.com/office/drawing/2016/5/12/chartex" xmlns:cx7="http://schemas.microsoft.com/office/drawing/2016/5/13/chartex" xmlns:cx8="http://schemas.microsoft.com/office/drawing/2016/5/14/chartex" xmlns:mc="http://schemas.openxmlformats.org/markup-compatibility/2006" xmlns:aink="http://schemas.microsoft.com/office/drawing/2016/ink" xmlns:am3d="http://schemas.microsoft.com/office/drawing/2017/model3d" xmlns:o="urn:schemas-microsoft-com:office:office" xmlns:r="http://schemas.openxmlformats.org/officeDocument/2006/relationships" xmlns:m="http://schemas.openxmlformats.org/officeDocument/2006/math" xmlns:v="urn:schemas-microsoft-com:vml" xmlns:wp14="http://schemas.microsoft.com/office/word/2010/wordprocessingDrawing" xmlns:wp="http://schemas.openxmlformats.org/drawingml/2006/wordprocessingDrawing" xmlns:w10="urn:schemas-microsoft-com:office:word" xmlns:w="http://schemas.openxmlformats.org/wordprocessingml/2006/main" xmlns:w14="http://schemas.microsoft.com/office/word/2010/wordml" xmlns:w15="http://schemas.microsoft.com/office/word/2012/wordml" xmlns:w16cex="http://schemas.microsoft.com/office/word/2018/wordml/cex" xmlns:w16cid="http://schemas.microsoft.com/office/word/2016/wordml/cid" xmlns:w16="http://schemas.microsoft.com/office/word/2018/wordml" xmlns:w16sdtdh="http://schemas.microsoft.com/office/word/2020/wordml/sdtdatahash" xmlns:w16se="http://schemas.microsoft.com/office/word/2015/wordml/symex" xmlns:wpg="http://schemas.microsoft.com/office/word/2010/wordprocessingGroup" xmlns:wpi="http://schemas.microsoft.com/office/word/2010/wordprocessingInk" xmlns:wne="http://schemas.microsoft.com/office/word/2006/wordml" xmlns:wps="http://schemas.microsoft.com/office/word/2010/wordprocessingShape" mc:Ignorable="w14 w15 w16se w16cid w16 w16cex w16sdtdh wp14">
+<w:ftr xmlns:wpc="http://schemas.microsoft.com/office/word/2010/wordprocessingCanvas" xmlns:cx="http://schemas.microsoft.com/office/drawing/2014/chartex" xmlns:cx1="http://schemas.microsoft.com/office/drawing/2015/9/8/chartex" xmlns:cx2="http://schemas.microsoft.com/office/drawing/2015/10/21/chartex" xmlns:cx3="http://schemas.microsoft.com/office/drawing/2016/5/9/chartex" xmlns:cx4="http://schemas.microsoft.com/office/drawing/2016/5/10/chartex" xmlns:cx5="http://schemas.microsoft.com/office/drawing/2016/5/11/chartex" xmlns:cx6="http://schemas.microsoft.com/office/drawing/2016/5/12/chartex" xmlns:cx7="http://schemas.microsoft.com/office/drawing/2016/5/13/chartex" xmlns:cx8="http://schemas.microsoft.com/office/drawing/2016/5/14/chartex" xmlns:mc="http://schemas.openxmlformats.org/markup-compatibility/2006" xmlns:aink="http://schemas.microsoft.com/office/drawing/2016/ink" xmlns:am3d="http://schemas.microsoft.com/office/drawing/2017/model3d" xmlns:o="urn:schemas-microsoft-com:office:office" xmlns:oel="http://schemas.microsoft.com/office/2019/extlst" xmlns:r="http://schemas.openxmlformats.org/officeDocument/2006/relationships" xmlns:m="http://schemas.openxmlformats.org/officeDocument/2006/math" xmlns:v="urn:schemas-microsoft-com:vml" xmlns:wp14="http://schemas.microsoft.com/office/word/2010/wordprocessingDrawing" xmlns:wp="http://schemas.openxmlformats.org/drawingml/2006/wordprocessingDrawing" xmlns:w10="urn:schemas-microsoft-com:office:word" xmlns:w="http://schemas.openxmlformats.org/wordprocessingml/2006/main" xmlns:w14="http://schemas.microsoft.com/office/word/2010/wordml" xmlns:w15="http://schemas.microsoft.com/office/word/2012/wordml" xmlns:w16cex="http://schemas.microsoft.com/office/word/2018/wordml/cex" xmlns:w16cid="http://schemas.microsoft.com/office/word/2016/wordml/cid" xmlns:w16="http://schemas.microsoft.com/office/word/2018/wordml" xmlns:w16du="http://schemas.microsoft.com/office/word/2023/wordml/word16du" xmlns:w16sdtdh="http://schemas.microsoft.com/office/word/2020/wordml/sdtdatahash" xmlns:w16sdtfl="http://schemas.microsoft.com/office/word/2024/wordml/sdtformatlock" xmlns:w16se="http://schemas.microsoft.com/office/word/2015/wordml/symex" xmlns:wpg="http://schemas.microsoft.com/office/word/2010/wordprocessingGroup" xmlns:wpi="http://schemas.microsoft.com/office/word/2010/wordprocessingInk" xmlns:wne="http://schemas.microsoft.com/office/word/2006/wordml" xmlns:wps="http://schemas.microsoft.com/office/word/2010/wordprocessingShape" mc:Ignorable="w14 w15 w16se w16cid w16 w16cex w16sdtdh w16sdtfl w16du wp14">
   <w:sdt>
     <w:sdtPr>
       <w:id w:val="451986563"/>
@@ -11668,7 +10913,7 @@
 </file>
 
 <file path=word/footer2.xml><?xml version="1.0" encoding="utf-8"?>
-<w:ftr xmlns:wpc="http://schemas.microsoft.com/office/word/2010/wordprocessingCanvas" xmlns:cx="http://schemas.microsoft.com/office/drawing/2014/chartex" xmlns:cx1="http://schemas.microsoft.com/office/drawing/2015/9/8/chartex" xmlns:cx2="http://schemas.microsoft.com/office/drawing/2015/10/21/chartex" xmlns:cx3="http://schemas.microsoft.com/office/drawing/2016/5/9/chartex" xmlns:cx4="http://schemas.microsoft.com/office/drawing/2016/5/10/chartex" xmlns:cx5="http://schemas.microsoft.com/office/drawing/2016/5/11/chartex" xmlns:cx6="http://schemas.microsoft.com/office/drawing/2016/5/12/chartex" xmlns:cx7="http://schemas.microsoft.com/office/drawing/2016/5/13/chartex" xmlns:cx8="http://schemas.microsoft.com/office/drawing/2016/5/14/chartex" xmlns:mc="http://schemas.openxmlformats.org/markup-compatibility/2006" xmlns:aink="http://schemas.microsoft.com/office/drawing/2016/ink" xmlns:am3d="http://schemas.microsoft.com/office/drawing/2017/model3d" xmlns:o="urn:schemas-microsoft-com:office:office" xmlns:r="http://schemas.openxmlformats.org/officeDocument/2006/relationships" xmlns:m="http://schemas.openxmlformats.org/officeDocument/2006/math" xmlns:v="urn:schemas-microsoft-com:vml" xmlns:wp14="http://schemas.microsoft.com/office/word/2010/wordprocessingDrawing" xmlns:wp="http://schemas.openxmlformats.org/drawingml/2006/wordprocessingDrawing" xmlns:w10="urn:schemas-microsoft-com:office:word" xmlns:w="http://schemas.openxmlformats.org/wordprocessingml/2006/main" xmlns:w14="http://schemas.microsoft.com/office/word/2010/wordml" xmlns:w15="http://schemas.microsoft.com/office/word/2012/wordml" xmlns:w16cex="http://schemas.microsoft.com/office/word/2018/wordml/cex" xmlns:w16cid="http://schemas.microsoft.com/office/word/2016/wordml/cid" xmlns:w16="http://schemas.microsoft.com/office/word/2018/wordml" xmlns:w16sdtdh="http://schemas.microsoft.com/office/word/2020/wordml/sdtdatahash" xmlns:w16se="http://schemas.microsoft.com/office/word/2015/wordml/symex" xmlns:wpg="http://schemas.microsoft.com/office/word/2010/wordprocessingGroup" xmlns:wpi="http://schemas.microsoft.com/office/word/2010/wordprocessingInk" xmlns:wne="http://schemas.microsoft.com/office/word/2006/wordml" xmlns:wps="http://schemas.microsoft.com/office/word/2010/wordprocessingShape" mc:Ignorable="w14 w15 w16se w16cid w16 w16cex w16sdtdh wp14">
+<w:ftr xmlns:wpc="http://schemas.microsoft.com/office/word/2010/wordprocessingCanvas" xmlns:cx="http://schemas.microsoft.com/office/drawing/2014/chartex" xmlns:cx1="http://schemas.microsoft.com/office/drawing/2015/9/8/chartex" xmlns:cx2="http://schemas.microsoft.com/office/drawing/2015/10/21/chartex" xmlns:cx3="http://schemas.microsoft.com/office/drawing/2016/5/9/chartex" xmlns:cx4="http://schemas.microsoft.com/office/drawing/2016/5/10/chartex" xmlns:cx5="http://schemas.microsoft.com/office/drawing/2016/5/11/chartex" xmlns:cx6="http://schemas.microsoft.com/office/drawing/2016/5/12/chartex" xmlns:cx7="http://schemas.microsoft.com/office/drawing/2016/5/13/chartex" xmlns:cx8="http://schemas.microsoft.com/office/drawing/2016/5/14/chartex" xmlns:mc="http://schemas.openxmlformats.org/markup-compatibility/2006" xmlns:aink="http://schemas.microsoft.com/office/drawing/2016/ink" xmlns:am3d="http://schemas.microsoft.com/office/drawing/2017/model3d" xmlns:o="urn:schemas-microsoft-com:office:office" xmlns:oel="http://schemas.microsoft.com/office/2019/extlst" xmlns:r="http://schemas.openxmlformats.org/officeDocument/2006/relationships" xmlns:m="http://schemas.openxmlformats.org/officeDocument/2006/math" xmlns:v="urn:schemas-microsoft-com:vml" xmlns:wp14="http://schemas.microsoft.com/office/word/2010/wordprocessingDrawing" xmlns:wp="http://schemas.openxmlformats.org/drawingml/2006/wordprocessingDrawing" xmlns:w10="urn:schemas-microsoft-com:office:word" xmlns:w="http://schemas.openxmlformats.org/wordprocessingml/2006/main" xmlns:w14="http://schemas.microsoft.com/office/word/2010/wordml" xmlns:w15="http://schemas.microsoft.com/office/word/2012/wordml" xmlns:w16cex="http://schemas.microsoft.com/office/word/2018/wordml/cex" xmlns:w16cid="http://schemas.microsoft.com/office/word/2016/wordml/cid" xmlns:w16="http://schemas.microsoft.com/office/word/2018/wordml" xmlns:w16du="http://schemas.microsoft.com/office/word/2023/wordml/word16du" xmlns:w16sdtdh="http://schemas.microsoft.com/office/word/2020/wordml/sdtdatahash" xmlns:w16sdtfl="http://schemas.microsoft.com/office/word/2024/wordml/sdtformatlock" xmlns:w16se="http://schemas.microsoft.com/office/word/2015/wordml/symex" xmlns:wpg="http://schemas.microsoft.com/office/word/2010/wordprocessingGroup" xmlns:wpi="http://schemas.microsoft.com/office/word/2010/wordprocessingInk" xmlns:wne="http://schemas.microsoft.com/office/word/2006/wordml" xmlns:wps="http://schemas.microsoft.com/office/word/2010/wordprocessingShape" mc:Ignorable="w14 w15 w16se w16cid w16 w16cex w16sdtdh w16sdtfl w16du wp14">
   <w:sdt>
     <w:sdtPr>
       <w:id w:val="-803773781"/>
@@ -11716,7 +10961,7 @@
 </file>
 
 <file path=word/footnotes.xml><?xml version="1.0" encoding="utf-8"?>
-<w:footnotes xmlns:wpc="http://schemas.microsoft.com/office/word/2010/wordprocessingCanvas" xmlns:cx="http://schemas.microsoft.com/office/drawing/2014/chartex" xmlns:cx1="http://schemas.microsoft.com/office/drawing/2015/9/8/chartex" xmlns:cx2="http://schemas.microsoft.com/office/drawing/2015/10/21/chartex" xmlns:cx3="http://schemas.microsoft.com/office/drawing/2016/5/9/chartex" xmlns:cx4="http://schemas.microsoft.com/office/drawing/2016/5/10/chartex" xmlns:cx5="http://schemas.microsoft.com/office/drawing/2016/5/11/chartex" xmlns:cx6="http://schemas.microsoft.com/office/drawing/2016/5/12/chartex" xmlns:cx7="http://schemas.microsoft.com/office/drawing/2016/5/13/chartex" xmlns:cx8="http://schemas.microsoft.com/office/drawing/2016/5/14/chartex" xmlns:mc="http://schemas.openxmlformats.org/markup-compatibility/2006" xmlns:aink="http://schemas.microsoft.com/office/drawing/2016/ink" xmlns:am3d="http://schemas.microsoft.com/office/drawing/2017/model3d" xmlns:o="urn:schemas-microsoft-com:office:office" xmlns:r="http://schemas.openxmlformats.org/officeDocument/2006/relationships" xmlns:m="http://schemas.openxmlformats.org/officeDocument/2006/math" xmlns:v="urn:schemas-microsoft-com:vml" xmlns:wp14="http://schemas.microsoft.com/office/word/2010/wordprocessingDrawing" xmlns:wp="http://schemas.openxmlformats.org/drawingml/2006/wordprocessingDrawing" xmlns:w10="urn:schemas-microsoft-com:office:word" xmlns:w="http://schemas.openxmlformats.org/wordprocessingml/2006/main" xmlns:w14="http://schemas.microsoft.com/office/word/2010/wordml" xmlns:w15="http://schemas.microsoft.com/office/word/2012/wordml" xmlns:w16cex="http://schemas.microsoft.com/office/word/2018/wordml/cex" xmlns:w16cid="http://schemas.microsoft.com/office/word/2016/wordml/cid" xmlns:w16="http://schemas.microsoft.com/office/word/2018/wordml" xmlns:w16sdtdh="http://schemas.microsoft.com/office/word/2020/wordml/sdtdatahash" xmlns:w16se="http://schemas.microsoft.com/office/word/2015/wordml/symex" xmlns:wpg="http://schemas.microsoft.com/office/word/2010/wordprocessingGroup" xmlns:wpi="http://schemas.microsoft.com/office/word/2010/wordprocessingInk" xmlns:wne="http://schemas.microsoft.com/office/word/2006/wordml" xmlns:wps="http://schemas.microsoft.com/office/word/2010/wordprocessingShape" mc:Ignorable="w14 w15 w16se w16cid w16 w16cex w16sdtdh wp14">
+<w:footnotes xmlns:wpc="http://schemas.microsoft.com/office/word/2010/wordprocessingCanvas" xmlns:cx="http://schemas.microsoft.com/office/drawing/2014/chartex" xmlns:cx1="http://schemas.microsoft.com/office/drawing/2015/9/8/chartex" xmlns:cx2="http://schemas.microsoft.com/office/drawing/2015/10/21/chartex" xmlns:cx3="http://schemas.microsoft.com/office/drawing/2016/5/9/chartex" xmlns:cx4="http://schemas.microsoft.com/office/drawing/2016/5/10/chartex" xmlns:cx5="http://schemas.microsoft.com/office/drawing/2016/5/11/chartex" xmlns:cx6="http://schemas.microsoft.com/office/drawing/2016/5/12/chartex" xmlns:cx7="http://schemas.microsoft.com/office/drawing/2016/5/13/chartex" xmlns:cx8="http://schemas.microsoft.com/office/drawing/2016/5/14/chartex" xmlns:mc="http://schemas.openxmlformats.org/markup-compatibility/2006" xmlns:aink="http://schemas.microsoft.com/office/drawing/2016/ink" xmlns:am3d="http://schemas.microsoft.com/office/drawing/2017/model3d" xmlns:o="urn:schemas-microsoft-com:office:office" xmlns:oel="http://schemas.microsoft.com/office/2019/extlst" xmlns:r="http://schemas.openxmlformats.org/officeDocument/2006/relationships" xmlns:m="http://schemas.openxmlformats.org/officeDocument/2006/math" xmlns:v="urn:schemas-microsoft-com:vml" xmlns:wp14="http://schemas.microsoft.com/office/word/2010/wordprocessingDrawing" xmlns:wp="http://schemas.openxmlformats.org/drawingml/2006/wordprocessingDrawing" xmlns:w10="urn:schemas-microsoft-com:office:word" xmlns:w="http://schemas.openxmlformats.org/wordprocessingml/2006/main" xmlns:w14="http://schemas.microsoft.com/office/word/2010/wordml" xmlns:w15="http://schemas.microsoft.com/office/word/2012/wordml" xmlns:w16cex="http://schemas.microsoft.com/office/word/2018/wordml/cex" xmlns:w16cid="http://schemas.microsoft.com/office/word/2016/wordml/cid" xmlns:w16="http://schemas.microsoft.com/office/word/2018/wordml" xmlns:w16du="http://schemas.microsoft.com/office/word/2023/wordml/word16du" xmlns:w16sdtdh="http://schemas.microsoft.com/office/word/2020/wordml/sdtdatahash" xmlns:w16sdtfl="http://schemas.microsoft.com/office/word/2024/wordml/sdtformatlock" xmlns:w16se="http://schemas.microsoft.com/office/word/2015/wordml/symex" xmlns:wpg="http://schemas.microsoft.com/office/word/2010/wordprocessingGroup" xmlns:wpi="http://schemas.microsoft.com/office/word/2010/wordprocessingInk" xmlns:wne="http://schemas.microsoft.com/office/word/2006/wordml" xmlns:wps="http://schemas.microsoft.com/office/word/2010/wordprocessingShape" mc:Ignorable="w14 w15 w16se w16cid w16 w16cex w16sdtdh w16sdtfl w16du wp14">
   <w:footnote w:type="separator" w:id="-1">
     <w:p>
       <w:pPr>
@@ -11790,7 +11035,7 @@
 </file>
 
 <file path=word/header1.xml><?xml version="1.0" encoding="utf-8"?>
-<w:hdr xmlns:wpc="http://schemas.microsoft.com/office/word/2010/wordprocessingCanvas" xmlns:cx="http://schemas.microsoft.com/office/drawing/2014/chartex" xmlns:cx1="http://schemas.microsoft.com/office/drawing/2015/9/8/chartex" xmlns:cx2="http://schemas.microsoft.com/office/drawing/2015/10/21/chartex" xmlns:cx3="http://schemas.microsoft.com/office/drawing/2016/5/9/chartex" xmlns:cx4="http://schemas.microsoft.com/office/drawing/2016/5/10/chartex" xmlns:cx5="http://schemas.microsoft.com/office/drawing/2016/5/11/chartex" xmlns:cx6="http://schemas.microsoft.com/office/drawing/2016/5/12/chartex" xmlns:cx7="http://schemas.microsoft.com/office/drawing/2016/5/13/chartex" xmlns:cx8="http://schemas.microsoft.com/office/drawing/2016/5/14/chartex" xmlns:mc="http://schemas.openxmlformats.org/markup-compatibility/2006" xmlns:aink="http://schemas.microsoft.com/office/drawing/2016/ink" xmlns:am3d="http://schemas.microsoft.com/office/drawing/2017/model3d" xmlns:o="urn:schemas-microsoft-com:office:office" xmlns:r="http://schemas.openxmlformats.org/officeDocument/2006/relationships" xmlns:m="http://schemas.openxmlformats.org/officeDocument/2006/math" xmlns:v="urn:schemas-microsoft-com:vml" xmlns:wp14="http://schemas.microsoft.com/office/word/2010/wordprocessingDrawing" xmlns:wp="http://schemas.openxmlformats.org/drawingml/2006/wordprocessingDrawing" xmlns:w10="urn:schemas-microsoft-com:office:word" xmlns:w="http://schemas.openxmlformats.org/wordprocessingml/2006/main" xmlns:w14="http://schemas.microsoft.com/office/word/2010/wordml" xmlns:w15="http://schemas.microsoft.com/office/word/2012/wordml" xmlns:w16cex="http://schemas.microsoft.com/office/word/2018/wordml/cex" xmlns:w16cid="http://schemas.microsoft.com/office/word/2016/wordml/cid" xmlns:w16="http://schemas.microsoft.com/office/word/2018/wordml" xmlns:w16sdtdh="http://schemas.microsoft.com/office/word/2020/wordml/sdtdatahash" xmlns:w16se="http://schemas.microsoft.com/office/word/2015/wordml/symex" xmlns:wpg="http://schemas.microsoft.com/office/word/2010/wordprocessingGroup" xmlns:wpi="http://schemas.microsoft.com/office/word/2010/wordprocessingInk" xmlns:wne="http://schemas.microsoft.com/office/word/2006/wordml" xmlns:wps="http://schemas.microsoft.com/office/word/2010/wordprocessingShape" mc:Ignorable="w14 w15 w16se w16cid w16 w16cex w16sdtdh wp14">
+<w:hdr xmlns:wpc="http://schemas.microsoft.com/office/word/2010/wordprocessingCanvas" xmlns:cx="http://schemas.microsoft.com/office/drawing/2014/chartex" xmlns:cx1="http://schemas.microsoft.com/office/drawing/2015/9/8/chartex" xmlns:cx2="http://schemas.microsoft.com/office/drawing/2015/10/21/chartex" xmlns:cx3="http://schemas.microsoft.com/office/drawing/2016/5/9/chartex" xmlns:cx4="http://schemas.microsoft.com/office/drawing/2016/5/10/chartex" xmlns:cx5="http://schemas.microsoft.com/office/drawing/2016/5/11/chartex" xmlns:cx6="http://schemas.microsoft.com/office/drawing/2016/5/12/chartex" xmlns:cx7="http://schemas.microsoft.com/office/drawing/2016/5/13/chartex" xmlns:cx8="http://schemas.microsoft.com/office/drawing/2016/5/14/chartex" xmlns:mc="http://schemas.openxmlformats.org/markup-compatibility/2006" xmlns:aink="http://schemas.microsoft.com/office/drawing/2016/ink" xmlns:am3d="http://schemas.microsoft.com/office/drawing/2017/model3d" xmlns:o="urn:schemas-microsoft-com:office:office" xmlns:oel="http://schemas.microsoft.com/office/2019/extlst" xmlns:r="http://schemas.openxmlformats.org/officeDocument/2006/relationships" xmlns:m="http://schemas.openxmlformats.org/officeDocument/2006/math" xmlns:v="urn:schemas-microsoft-com:vml" xmlns:wp14="http://schemas.microsoft.com/office/word/2010/wordprocessingDrawing" xmlns:wp="http://schemas.openxmlformats.org/drawingml/2006/wordprocessingDrawing" xmlns:w10="urn:schemas-microsoft-com:office:word" xmlns:w="http://schemas.openxmlformats.org/wordprocessingml/2006/main" xmlns:w14="http://schemas.microsoft.com/office/word/2010/wordml" xmlns:w15="http://schemas.microsoft.com/office/word/2012/wordml" xmlns:w16cex="http://schemas.microsoft.com/office/word/2018/wordml/cex" xmlns:w16cid="http://schemas.microsoft.com/office/word/2016/wordml/cid" xmlns:w16="http://schemas.microsoft.com/office/word/2018/wordml" xmlns:w16du="http://schemas.microsoft.com/office/word/2023/wordml/word16du" xmlns:w16sdtdh="http://schemas.microsoft.com/office/word/2020/wordml/sdtdatahash" xmlns:w16sdtfl="http://schemas.microsoft.com/office/word/2024/wordml/sdtformatlock" xmlns:w16se="http://schemas.microsoft.com/office/word/2015/wordml/symex" xmlns:wpg="http://schemas.microsoft.com/office/word/2010/wordprocessingGroup" xmlns:wpi="http://schemas.microsoft.com/office/word/2010/wordprocessingInk" xmlns:wne="http://schemas.microsoft.com/office/word/2006/wordml" xmlns:wps="http://schemas.microsoft.com/office/word/2010/wordprocessingShape" mc:Ignorable="w14 w15 w16se w16cid w16 w16cex w16sdtdh w16sdtfl w16du wp14">
   <w:p>
     <w:pPr>
       <w:pStyle w:val="Header"/>
@@ -11800,7 +11045,7 @@
 </file>
 
 <file path=word/header2.xml><?xml version="1.0" encoding="utf-8"?>
-<w:hdr xmlns:wpc="http://schemas.microsoft.com/office/word/2010/wordprocessingCanvas" xmlns:cx="http://schemas.microsoft.com/office/drawing/2014/chartex" xmlns:cx1="http://schemas.microsoft.com/office/drawing/2015/9/8/chartex" xmlns:cx2="http://schemas.microsoft.com/office/drawing/2015/10/21/chartex" xmlns:cx3="http://schemas.microsoft.com/office/drawing/2016/5/9/chartex" xmlns:cx4="http://schemas.microsoft.com/office/drawing/2016/5/10/chartex" xmlns:cx5="http://schemas.microsoft.com/office/drawing/2016/5/11/chartex" xmlns:cx6="http://schemas.microsoft.com/office/drawing/2016/5/12/chartex" xmlns:cx7="http://schemas.microsoft.com/office/drawing/2016/5/13/chartex" xmlns:cx8="http://schemas.microsoft.com/office/drawing/2016/5/14/chartex" xmlns:mc="http://schemas.openxmlformats.org/markup-compatibility/2006" xmlns:aink="http://schemas.microsoft.com/office/drawing/2016/ink" xmlns:am3d="http://schemas.microsoft.com/office/drawing/2017/model3d" xmlns:o="urn:schemas-microsoft-com:office:office" xmlns:r="http://schemas.openxmlformats.org/officeDocument/2006/relationships" xmlns:m="http://schemas.openxmlformats.org/officeDocument/2006/math" xmlns:v="urn:schemas-microsoft-com:vml" xmlns:wp14="http://schemas.microsoft.com/office/word/2010/wordprocessingDrawing" xmlns:wp="http://schemas.openxmlformats.org/drawingml/2006/wordprocessingDrawing" xmlns:w10="urn:schemas-microsoft-com:office:word" xmlns:w="http://schemas.openxmlformats.org/wordprocessingml/2006/main" xmlns:w14="http://schemas.microsoft.com/office/word/2010/wordml" xmlns:w15="http://schemas.microsoft.com/office/word/2012/wordml" xmlns:w16cex="http://schemas.microsoft.com/office/word/2018/wordml/cex" xmlns:w16cid="http://schemas.microsoft.com/office/word/2016/wordml/cid" xmlns:w16="http://schemas.microsoft.com/office/word/2018/wordml" xmlns:w16sdtdh="http://schemas.microsoft.com/office/word/2020/wordml/sdtdatahash" xmlns:w16se="http://schemas.microsoft.com/office/word/2015/wordml/symex" xmlns:wpg="http://schemas.microsoft.com/office/word/2010/wordprocessingGroup" xmlns:wpi="http://schemas.microsoft.com/office/word/2010/wordprocessingInk" xmlns:wne="http://schemas.microsoft.com/office/word/2006/wordml" xmlns:wps="http://schemas.microsoft.com/office/word/2010/wordprocessingShape" mc:Ignorable="w14 w15 w16se w16cid w16 w16cex w16sdtdh wp14">
+<w:hdr xmlns:wpc="http://schemas.microsoft.com/office/word/2010/wordprocessingCanvas" xmlns:cx="http://schemas.microsoft.com/office/drawing/2014/chartex" xmlns:cx1="http://schemas.microsoft.com/office/drawing/2015/9/8/chartex" xmlns:cx2="http://schemas.microsoft.com/office/drawing/2015/10/21/chartex" xmlns:cx3="http://schemas.microsoft.com/office/drawing/2016/5/9/chartex" xmlns:cx4="http://schemas.microsoft.com/office/drawing/2016/5/10/chartex" xmlns:cx5="http://schemas.microsoft.com/office/drawing/2016/5/11/chartex" xmlns:cx6="http://schemas.microsoft.com/office/drawing/2016/5/12/chartex" xmlns:cx7="http://schemas.microsoft.com/office/drawing/2016/5/13/chartex" xmlns:cx8="http://schemas.microsoft.com/office/drawing/2016/5/14/chartex" xmlns:mc="http://schemas.openxmlformats.org/markup-compatibility/2006" xmlns:aink="http://schemas.microsoft.com/office/drawing/2016/ink" xmlns:am3d="http://schemas.microsoft.com/office/drawing/2017/model3d" xmlns:o="urn:schemas-microsoft-com:office:office" xmlns:oel="http://schemas.microsoft.com/office/2019/extlst" xmlns:r="http://schemas.openxmlformats.org/officeDocument/2006/relationships" xmlns:m="http://schemas.openxmlformats.org/officeDocument/2006/math" xmlns:v="urn:schemas-microsoft-com:vml" xmlns:wp14="http://schemas.microsoft.com/office/word/2010/wordprocessingDrawing" xmlns:wp="http://schemas.openxmlformats.org/drawingml/2006/wordprocessingDrawing" xmlns:w10="urn:schemas-microsoft-com:office:word" xmlns:w="http://schemas.openxmlformats.org/wordprocessingml/2006/main" xmlns:w14="http://schemas.microsoft.com/office/word/2010/wordml" xmlns:w15="http://schemas.microsoft.com/office/word/2012/wordml" xmlns:w16cex="http://schemas.microsoft.com/office/word/2018/wordml/cex" xmlns:w16cid="http://schemas.microsoft.com/office/word/2016/wordml/cid" xmlns:w16="http://schemas.microsoft.com/office/word/2018/wordml" xmlns:w16du="http://schemas.microsoft.com/office/word/2023/wordml/word16du" xmlns:w16sdtdh="http://schemas.microsoft.com/office/word/2020/wordml/sdtdatahash" xmlns:w16sdtfl="http://schemas.microsoft.com/office/word/2024/wordml/sdtformatlock" xmlns:w16se="http://schemas.microsoft.com/office/word/2015/wordml/symex" xmlns:wpg="http://schemas.microsoft.com/office/word/2010/wordprocessingGroup" xmlns:wpi="http://schemas.microsoft.com/office/word/2010/wordprocessingInk" xmlns:wne="http://schemas.microsoft.com/office/word/2006/wordml" xmlns:wps="http://schemas.microsoft.com/office/word/2010/wordprocessingShape" mc:Ignorable="w14 w15 w16se w16cid w16 w16cex w16sdtdh w16sdtfl w16du wp14">
   <w:p>
     <w:pPr>
       <w:pStyle w:val="Header"/>
@@ -11810,7 +11055,7 @@
 </file>
 
 <file path=word/numbering.xml><?xml version="1.0" encoding="utf-8"?>
-<w:numbering xmlns:wpc="http://schemas.microsoft.com/office/word/2010/wordprocessingCanvas" xmlns:cx="http://schemas.microsoft.com/office/drawing/2014/chartex" xmlns:cx1="http://schemas.microsoft.com/office/drawing/2015/9/8/chartex" xmlns:cx2="http://schemas.microsoft.com/office/drawing/2015/10/21/chartex" xmlns:cx3="http://schemas.microsoft.com/office/drawing/2016/5/9/chartex" xmlns:cx4="http://schemas.microsoft.com/office/drawing/2016/5/10/chartex" xmlns:cx5="http://schemas.microsoft.com/office/drawing/2016/5/11/chartex" xmlns:cx6="http://schemas.microsoft.com/office/drawing/2016/5/12/chartex" xmlns:cx7="http://schemas.microsoft.com/office/drawing/2016/5/13/chartex" xmlns:cx8="http://schemas.microsoft.com/office/drawing/2016/5/14/chartex" xmlns:mc="http://schemas.openxmlformats.org/markup-compatibility/2006" xmlns:aink="http://schemas.microsoft.com/office/drawing/2016/ink" xmlns:am3d="http://schemas.microsoft.com/office/drawing/2017/model3d" xmlns:o="urn:schemas-microsoft-com:office:office" xmlns:r="http://schemas.openxmlformats.org/officeDocument/2006/relationships" xmlns:m="http://schemas.openxmlformats.org/officeDocument/2006/math" xmlns:v="urn:schemas-microsoft-com:vml" xmlns:wp14="http://schemas.microsoft.com/office/word/2010/wordprocessingDrawing" xmlns:wp="http://schemas.openxmlformats.org/drawingml/2006/wordprocessingDrawing" xmlns:w10="urn:schemas-microsoft-com:office:word" xmlns:w="http://schemas.openxmlformats.org/wordprocessingml/2006/main" xmlns:w14="http://schemas.microsoft.com/office/word/2010/wordml" xmlns:w15="http://schemas.microsoft.com/office/word/2012/wordml" xmlns:w16cex="http://schemas.microsoft.com/office/word/2018/wordml/cex" xmlns:w16cid="http://schemas.microsoft.com/office/word/2016/wordml/cid" xmlns:w16="http://schemas.microsoft.com/office/word/2018/wordml" xmlns:w16sdtdh="http://schemas.microsoft.com/office/word/2020/wordml/sdtdatahash" xmlns:w16se="http://schemas.microsoft.com/office/word/2015/wordml/symex" xmlns:wpg="http://schemas.microsoft.com/office/word/2010/wordprocessingGroup" xmlns:wpi="http://schemas.microsoft.com/office/word/2010/wordprocessingInk" xmlns:wne="http://schemas.microsoft.com/office/word/2006/wordml" xmlns:wps="http://schemas.microsoft.com/office/word/2010/wordprocessingShape" mc:Ignorable="w14 w15 w16se w16cid w16 w16cex w16sdtdh wp14">
+<w:numbering xmlns:wpc="http://schemas.microsoft.com/office/word/2010/wordprocessingCanvas" xmlns:cx="http://schemas.microsoft.com/office/drawing/2014/chartex" xmlns:cx1="http://schemas.microsoft.com/office/drawing/2015/9/8/chartex" xmlns:cx2="http://schemas.microsoft.com/office/drawing/2015/10/21/chartex" xmlns:cx3="http://schemas.microsoft.com/office/drawing/2016/5/9/chartex" xmlns:cx4="http://schemas.microsoft.com/office/drawing/2016/5/10/chartex" xmlns:cx5="http://schemas.microsoft.com/office/drawing/2016/5/11/chartex" xmlns:cx6="http://schemas.microsoft.com/office/drawing/2016/5/12/chartex" xmlns:cx7="http://schemas.microsoft.com/office/drawing/2016/5/13/chartex" xmlns:cx8="http://schemas.microsoft.com/office/drawing/2016/5/14/chartex" xmlns:mc="http://schemas.openxmlformats.org/markup-compatibility/2006" xmlns:aink="http://schemas.microsoft.com/office/drawing/2016/ink" xmlns:am3d="http://schemas.microsoft.com/office/drawing/2017/model3d" xmlns:o="urn:schemas-microsoft-com:office:office" xmlns:oel="http://schemas.microsoft.com/office/2019/extlst" xmlns:r="http://schemas.openxmlformats.org/officeDocument/2006/relationships" xmlns:m="http://schemas.openxmlformats.org/officeDocument/2006/math" xmlns:v="urn:schemas-microsoft-com:vml" xmlns:wp14="http://schemas.microsoft.com/office/word/2010/wordprocessingDrawing" xmlns:wp="http://schemas.openxmlformats.org/drawingml/2006/wordprocessingDrawing" xmlns:w10="urn:schemas-microsoft-com:office:word" xmlns:w="http://schemas.openxmlformats.org/wordprocessingml/2006/main" xmlns:w14="http://schemas.microsoft.com/office/word/2010/wordml" xmlns:w15="http://schemas.microsoft.com/office/word/2012/wordml" xmlns:w16cex="http://schemas.microsoft.com/office/word/2018/wordml/cex" xmlns:w16cid="http://schemas.microsoft.com/office/word/2016/wordml/cid" xmlns:w16="http://schemas.microsoft.com/office/word/2018/wordml" xmlns:w16du="http://schemas.microsoft.com/office/word/2023/wordml/word16du" xmlns:w16sdtdh="http://schemas.microsoft.com/office/word/2020/wordml/sdtdatahash" xmlns:w16sdtfl="http://schemas.microsoft.com/office/word/2024/wordml/sdtformatlock" xmlns:w16se="http://schemas.microsoft.com/office/word/2015/wordml/symex" xmlns:wpg="http://schemas.microsoft.com/office/word/2010/wordprocessingGroup" xmlns:wpi="http://schemas.microsoft.com/office/word/2010/wordprocessingInk" xmlns:wne="http://schemas.microsoft.com/office/word/2006/wordml" xmlns:wps="http://schemas.microsoft.com/office/word/2010/wordprocessingShape" mc:Ignorable="w14 w15 w16se w16cid w16 w16cex w16sdtdh w16sdtfl w16du wp14">
   <w:abstractNum w:abstractNumId="0" w15:restartNumberingAfterBreak="0">
     <w:nsid w:val="01013417"/>
     <w:multiLevelType w:val="multilevel"/>
@@ -13912,71 +13157,71 @@
       </w:rPr>
     </w:lvl>
   </w:abstractNum>
-  <w:num w:numId="1">
+  <w:num w:numId="1" w16cid:durableId="867454112">
     <w:abstractNumId w:val="7"/>
   </w:num>
-  <w:num w:numId="2">
+  <w:num w:numId="2" w16cid:durableId="232401085">
     <w:abstractNumId w:val="3"/>
   </w:num>
-  <w:num w:numId="3">
+  <w:num w:numId="3" w16cid:durableId="1954315635">
     <w:abstractNumId w:val="10"/>
   </w:num>
-  <w:num w:numId="4">
+  <w:num w:numId="4" w16cid:durableId="1895265470">
     <w:abstractNumId w:val="13"/>
   </w:num>
-  <w:num w:numId="5">
+  <w:num w:numId="5" w16cid:durableId="1537229977">
     <w:abstractNumId w:val="2"/>
   </w:num>
-  <w:num w:numId="6">
+  <w:num w:numId="6" w16cid:durableId="1395086848">
     <w:abstractNumId w:val="4"/>
   </w:num>
-  <w:num w:numId="7">
+  <w:num w:numId="7" w16cid:durableId="70858911">
     <w:abstractNumId w:val="16"/>
   </w:num>
-  <w:num w:numId="8">
+  <w:num w:numId="8" w16cid:durableId="152380384">
     <w:abstractNumId w:val="9"/>
   </w:num>
-  <w:num w:numId="9">
+  <w:num w:numId="9" w16cid:durableId="1792241820">
     <w:abstractNumId w:val="8"/>
   </w:num>
-  <w:num w:numId="10">
+  <w:num w:numId="10" w16cid:durableId="1800341820">
     <w:abstractNumId w:val="17"/>
   </w:num>
-  <w:num w:numId="11">
+  <w:num w:numId="11" w16cid:durableId="512762770">
     <w:abstractNumId w:val="19"/>
   </w:num>
-  <w:num w:numId="12">
+  <w:num w:numId="12" w16cid:durableId="239143770">
     <w:abstractNumId w:val="0"/>
   </w:num>
-  <w:num w:numId="13">
+  <w:num w:numId="13" w16cid:durableId="824203115">
     <w:abstractNumId w:val="14"/>
   </w:num>
-  <w:num w:numId="14">
+  <w:num w:numId="14" w16cid:durableId="1134181316">
     <w:abstractNumId w:val="15"/>
   </w:num>
-  <w:num w:numId="15">
+  <w:num w:numId="15" w16cid:durableId="280379843">
     <w:abstractNumId w:val="1"/>
   </w:num>
-  <w:num w:numId="16">
+  <w:num w:numId="16" w16cid:durableId="609318292">
     <w:abstractNumId w:val="12"/>
   </w:num>
-  <w:num w:numId="17">
+  <w:num w:numId="17" w16cid:durableId="1983003725">
     <w:abstractNumId w:val="11"/>
   </w:num>
-  <w:num w:numId="18">
+  <w:num w:numId="18" w16cid:durableId="1468208259">
     <w:abstractNumId w:val="18"/>
   </w:num>
-  <w:num w:numId="19">
+  <w:num w:numId="19" w16cid:durableId="585500453">
     <w:abstractNumId w:val="6"/>
   </w:num>
-  <w:num w:numId="20">
+  <w:num w:numId="20" w16cid:durableId="1805852839">
     <w:abstractNumId w:val="5"/>
   </w:num>
 </w:numbering>
 </file>
 
 <file path=word/people.xml><?xml version="1.0" encoding="utf-8"?>
-<w15:people xmlns:wpc="http://schemas.microsoft.com/office/word/2010/wordprocessingCanvas" xmlns:cx="http://schemas.microsoft.com/office/drawing/2014/chartex" xmlns:cx1="http://schemas.microsoft.com/office/drawing/2015/9/8/chartex" xmlns:cx2="http://schemas.microsoft.com/office/drawing/2015/10/21/chartex" xmlns:cx3="http://schemas.microsoft.com/office/drawing/2016/5/9/chartex" xmlns:cx4="http://schemas.microsoft.com/office/drawing/2016/5/10/chartex" xmlns:cx5="http://schemas.microsoft.com/office/drawing/2016/5/11/chartex" xmlns:cx6="http://schemas.microsoft.com/office/drawing/2016/5/12/chartex" xmlns:cx7="http://schemas.microsoft.com/office/drawing/2016/5/13/chartex" xmlns:cx8="http://schemas.microsoft.com/office/drawing/2016/5/14/chartex" xmlns:mc="http://schemas.openxmlformats.org/markup-compatibility/2006" xmlns:aink="http://schemas.microsoft.com/office/drawing/2016/ink" xmlns:am3d="http://schemas.microsoft.com/office/drawing/2017/model3d" xmlns:o="urn:schemas-microsoft-com:office:office" xmlns:r="http://schemas.openxmlformats.org/officeDocument/2006/relationships" xmlns:m="http://schemas.openxmlformats.org/officeDocument/2006/math" xmlns:v="urn:schemas-microsoft-com:vml" xmlns:wp14="http://schemas.microsoft.com/office/word/2010/wordprocessingDrawing" xmlns:wp="http://schemas.openxmlformats.org/drawingml/2006/wordprocessingDrawing" xmlns:w10="urn:schemas-microsoft-com:office:word" xmlns:w="http://schemas.openxmlformats.org/wordprocessingml/2006/main" xmlns:w14="http://schemas.microsoft.com/office/word/2010/wordml" xmlns:w15="http://schemas.microsoft.com/office/word/2012/wordml" xmlns:w16cex="http://schemas.microsoft.com/office/word/2018/wordml/cex" xmlns:w16cid="http://schemas.microsoft.com/office/word/2016/wordml/cid" xmlns:w16="http://schemas.microsoft.com/office/word/2018/wordml" xmlns:w16sdtdh="http://schemas.microsoft.com/office/word/2020/wordml/sdtdatahash" xmlns:w16se="http://schemas.microsoft.com/office/word/2015/wordml/symex" xmlns:wpg="http://schemas.microsoft.com/office/word/2010/wordprocessingGroup" xmlns:wpi="http://schemas.microsoft.com/office/word/2010/wordprocessingInk" xmlns:wne="http://schemas.microsoft.com/office/word/2006/wordml" xmlns:wps="http://schemas.microsoft.com/office/word/2010/wordprocessingShape" mc:Ignorable="w14 w15 w16se w16cid w16 w16cex w16sdtdh wp14">
+<w15:people xmlns:wpc="http://schemas.microsoft.com/office/word/2010/wordprocessingCanvas" xmlns:cx="http://schemas.microsoft.com/office/drawing/2014/chartex" xmlns:cx1="http://schemas.microsoft.com/office/drawing/2015/9/8/chartex" xmlns:cx2="http://schemas.microsoft.com/office/drawing/2015/10/21/chartex" xmlns:cx3="http://schemas.microsoft.com/office/drawing/2016/5/9/chartex" xmlns:cx4="http://schemas.microsoft.com/office/drawing/2016/5/10/chartex" xmlns:cx5="http://schemas.microsoft.com/office/drawing/2016/5/11/chartex" xmlns:cx6="http://schemas.microsoft.com/office/drawing/2016/5/12/chartex" xmlns:cx7="http://schemas.microsoft.com/office/drawing/2016/5/13/chartex" xmlns:cx8="http://schemas.microsoft.com/office/drawing/2016/5/14/chartex" xmlns:mc="http://schemas.openxmlformats.org/markup-compatibility/2006" xmlns:aink="http://schemas.microsoft.com/office/drawing/2016/ink" xmlns:am3d="http://schemas.microsoft.com/office/drawing/2017/model3d" xmlns:o="urn:schemas-microsoft-com:office:office" xmlns:oel="http://schemas.microsoft.com/office/2019/extlst" xmlns:r="http://schemas.openxmlformats.org/officeDocument/2006/relationships" xmlns:m="http://schemas.openxmlformats.org/officeDocument/2006/math" xmlns:v="urn:schemas-microsoft-com:vml" xmlns:wp14="http://schemas.microsoft.com/office/word/2010/wordprocessingDrawing" xmlns:wp="http://schemas.openxmlformats.org/drawingml/2006/wordprocessingDrawing" xmlns:w10="urn:schemas-microsoft-com:office:word" xmlns:w="http://schemas.openxmlformats.org/wordprocessingml/2006/main" xmlns:w14="http://schemas.microsoft.com/office/word/2010/wordml" xmlns:w15="http://schemas.microsoft.com/office/word/2012/wordml" xmlns:w16cex="http://schemas.microsoft.com/office/word/2018/wordml/cex" xmlns:w16cid="http://schemas.microsoft.com/office/word/2016/wordml/cid" xmlns:w16="http://schemas.microsoft.com/office/word/2018/wordml" xmlns:w16du="http://schemas.microsoft.com/office/word/2023/wordml/word16du" xmlns:w16sdtdh="http://schemas.microsoft.com/office/word/2020/wordml/sdtdatahash" xmlns:w16sdtfl="http://schemas.microsoft.com/office/word/2024/wordml/sdtformatlock" xmlns:w16se="http://schemas.microsoft.com/office/word/2015/wordml/symex" xmlns:wpg="http://schemas.microsoft.com/office/word/2010/wordprocessingGroup" xmlns:wpi="http://schemas.microsoft.com/office/word/2010/wordprocessingInk" xmlns:wne="http://schemas.microsoft.com/office/word/2006/wordml" xmlns:wps="http://schemas.microsoft.com/office/word/2010/wordprocessingShape" mc:Ignorable="w14 w15 w16se w16cid w16 w16cex w16sdtdh w16sdtfl w16du wp14">
   <w15:person w15:author="Nikoloz Bezhanishvili">
     <w15:presenceInfo w15:providerId="Windows Live" w15:userId="fc599e998db153eb"/>
   </w15:person>
@@ -13984,14 +13229,14 @@
 </file>
 
 <file path=word/styles.xml><?xml version="1.0" encoding="utf-8"?>
-<w:styles xmlns:mc="http://schemas.openxmlformats.org/markup-compatibility/2006" xmlns:r="http://schemas.openxmlformats.org/officeDocument/2006/relationships" xmlns:w="http://schemas.openxmlformats.org/wordprocessingml/2006/main" xmlns:w14="http://schemas.microsoft.com/office/word/2010/wordml" xmlns:w15="http://schemas.microsoft.com/office/word/2012/wordml" xmlns:w16cex="http://schemas.microsoft.com/office/word/2018/wordml/cex" xmlns:w16cid="http://schemas.microsoft.com/office/word/2016/wordml/cid" xmlns:w16="http://schemas.microsoft.com/office/word/2018/wordml" xmlns:w16sdtdh="http://schemas.microsoft.com/office/word/2020/wordml/sdtdatahash" xmlns:w16se="http://schemas.microsoft.com/office/word/2015/wordml/symex" mc:Ignorable="w14 w15 w16se w16cid w16 w16cex w16sdtdh">
+<w:styles xmlns:mc="http://schemas.openxmlformats.org/markup-compatibility/2006" xmlns:r="http://schemas.openxmlformats.org/officeDocument/2006/relationships" xmlns:w="http://schemas.openxmlformats.org/wordprocessingml/2006/main" xmlns:w14="http://schemas.microsoft.com/office/word/2010/wordml" xmlns:w15="http://schemas.microsoft.com/office/word/2012/wordml" xmlns:w16cex="http://schemas.microsoft.com/office/word/2018/wordml/cex" xmlns:w16cid="http://schemas.microsoft.com/office/word/2016/wordml/cid" xmlns:w16="http://schemas.microsoft.com/office/word/2018/wordml" xmlns:w16du="http://schemas.microsoft.com/office/word/2023/wordml/word16du" xmlns:w16sdtdh="http://schemas.microsoft.com/office/word/2020/wordml/sdtdatahash" xmlns:w16sdtfl="http://schemas.microsoft.com/office/word/2024/wordml/sdtformatlock" xmlns:w16se="http://schemas.microsoft.com/office/word/2015/wordml/symex" mc:Ignorable="w14 w15 w16se w16cid w16 w16cex w16sdtdh w16sdtfl w16du">
   <w:docDefaults>
     <w:rPrDefault>
       <w:rPr>
         <w:rFonts w:ascii="Sylfaen" w:eastAsiaTheme="minorHAnsi" w:hAnsi="Sylfaen" w:cstheme="minorBidi"/>
         <w:sz w:val="22"/>
         <w:szCs w:val="22"/>
-        <w:lang w:val="en-150" w:eastAsia="en-US" w:bidi="ar-SA"/>
+        <w:lang w:eastAsia="en-US" w:bidi="ar-SA"/>
       </w:rPr>
     </w:rPrDefault>
     <w:pPrDefault>
@@ -14456,6 +13701,7 @@
   <w:style w:type="character" w:default="1" w:styleId="DefaultParagraphFont">
     <w:name w:val="Default Paragraph Font"/>
     <w:uiPriority w:val="1"/>
+    <w:semiHidden/>
     <w:unhideWhenUsed/>
   </w:style>
   <w:style w:type="table" w:default="1" w:styleId="TableNormal">
@@ -14717,7 +13963,7 @@
       <w:rFonts w:ascii="Times New Roman" w:eastAsia="Times New Roman" w:hAnsi="Times New Roman" w:cs="Times New Roman"/>
       <w:sz w:val="24"/>
       <w:szCs w:val="24"/>
-      <w:lang w:eastAsia="en-150"/>
+      <w:lang/>
     </w:rPr>
   </w:style>
   <w:style w:type="paragraph" w:styleId="Header">

</xml_diff>